<commit_message>
feat: align ETP with CGBR model
</commit_message>
<xml_diff>
--- a/public/docflow/templates/MODELO_ETP.docx
+++ b/public/docflow/templates/MODELO_ETP.docx
@@ -3,8 +3,3504 @@
 <w:document xmlns:wpc="http://schemas.microsoft.com/office/word/2010/wordprocessingCanvas" xmlns:mc="http://schemas.openxmlformats.org/markup-compatibility/2006" xmlns:o="urn:schemas-microsoft-com:office:office" xmlns:r="http://schemas.openxmlformats.org/officeDocument/2006/relationships" xmlns:m="http://schemas.openxmlformats.org/officeDocument/2006/math" xmlns:v="urn:schemas-microsoft-com:vml" xmlns:wp14="http://schemas.microsoft.com/office/word/2010/wordprocessingDrawing" xmlns:wp="http://schemas.openxmlformats.org/drawingml/2006/wordprocessingDrawing" xmlns:w10="urn:schemas-microsoft-com:office:word" xmlns:w="http://schemas.openxmlformats.org/wordprocessingml/2006/main" xmlns:w14="http://schemas.microsoft.com/office/word/2010/wordml" xmlns:w15="http://schemas.microsoft.com/office/word/2012/wordml" xmlns:wpg="http://schemas.microsoft.com/office/word/2010/wordprocessingGroup" xmlns:wpi="http://schemas.microsoft.com/office/word/2010/wordprocessingInk" xmlns:wne="http://schemas.microsoft.com/office/word/2006/wordml" xmlns:wps="http://schemas.microsoft.com/office/word/2010/wordprocessingShape" mc:Ignorable="w14 w15 wp14">
   <w:body>
     <w:p>
-      <w:r>
-        <w:t>{{etp_content}}</w:t>
+      <w:pPr>
+        <w:spacing w:line="360" w:lineRule="auto"/>
+        <w:jc w:val="center"/>
+        <w:rPr>
+          <w:rFonts w:ascii="Arial" w:hAnsi="Arial" w:cs="Arial"/>
+          <w:b/>
+          <w:sz w:val="24"/>
+          <w:szCs w:val="24"/>
+          <w:u w:val="single"/>
+        </w:rPr>
+      </w:pPr>
+      <w:r>
+        <w:rPr>
+          <w:rFonts w:ascii="Arial" w:hAnsi="Arial" w:cs="Arial"/>
+          <w:b/>
+          <w:sz w:val="24"/>
+          <w:szCs w:val="24"/>
+        </w:rPr>
+        <w:t xml:space="preserve">ESTUDO TÉCNICO PRELIMINAR </w:t>
+      </w:r>
+      <w:r>
+        <w:rPr>
+          <w:rFonts w:ascii="Arial" w:hAnsi="Arial" w:cs="Arial"/>
+          <w:b/>
+          <w:sz w:val="24"/>
+          <w:szCs w:val="24"/>
+        </w:rPr>
+        <w:t>- ETP</w:t>
+      </w:r>
+    </w:p>
+    <w:p>
+      <w:pPr>
+        <w:spacing w:line="360" w:lineRule="auto"/>
+        <w:jc w:val="center"/>
+        <w:rPr>
+          <w:rFonts w:ascii="Arial" w:hAnsi="Arial" w:cs="Arial"/>
+          <w:b/>
+          <w:sz w:val="24"/>
+          <w:szCs w:val="24"/>
+        </w:rPr>
+      </w:pPr>
+      <w:r>
+        <w:rPr>
+          <w:rFonts w:ascii="Arial" w:hAnsi="Arial" w:cs="Arial"/>
+          <w:b/>
+          <w:sz w:val="24"/>
+          <w:szCs w:val="24"/>
+        </w:rPr>
+        <w:t>Lei Federal 14.</w:t>
+      </w:r>
+      <w:r>
+        <w:rPr>
+          <w:rFonts w:ascii="Arial" w:hAnsi="Arial" w:cs="Arial"/>
+          <w:b/>
+          <w:sz w:val="24"/>
+          <w:szCs w:val="24"/>
+        </w:rPr>
+        <w:t>1</w:t>
+      </w:r>
+      <w:r>
+        <w:rPr>
+          <w:rFonts w:ascii="Arial" w:hAnsi="Arial" w:cs="Arial"/>
+          <w:b/>
+          <w:sz w:val="24"/>
+          <w:szCs w:val="24"/>
+        </w:rPr>
+        <w:t>33/21</w:t>
+      </w:r>
+    </w:p>
+    <w:p>
+      <w:pPr>
+        <w:spacing w:line="360" w:lineRule="auto"/>
+        <w:jc w:val="center"/>
+        <w:rPr>
+          <w:rFonts w:ascii="Arial" w:hAnsi="Arial" w:cs="Arial"/>
+          <w:b/>
+          <w:sz w:val="24"/>
+          <w:szCs w:val="24"/>
+        </w:rPr>
+      </w:pPr>
+      <w:r>
+        <w:rPr>
+          <w:rFonts w:ascii="Arial" w:hAnsi="Arial" w:cs="Arial"/>
+          <w:b/>
+          <w:sz w:val="24"/>
+          <w:szCs w:val="24"/>
+        </w:rPr>
+        <w:t>REFERÊNCIAL</w:t>
+      </w:r>
+      <w:r>
+        <w:rPr>
+          <w:rFonts w:ascii="Arial" w:hAnsi="Arial" w:cs="Arial"/>
+          <w:b/>
+          <w:sz w:val="24"/>
+          <w:szCs w:val="24"/>
+        </w:rPr>
+        <w:t xml:space="preserve"> - OBRAS</w:t>
+      </w:r>
+    </w:p>
+    <w:p>
+      <w:pPr>
+        <w:spacing w:line="360" w:lineRule="auto"/>
+        <w:jc w:val="both"/>
+        <w:rPr>
+          <w:rFonts w:ascii="Arial" w:hAnsi="Arial" w:cs="Arial"/>
+          <w:sz w:val="24"/>
+          <w:szCs w:val="24"/>
+        </w:rPr>
+      </w:pPr>
+    </w:p>
+    <w:p>
+      <w:pPr>
+        <w:rPr>
+          <w:rFonts w:ascii="Arial" w:hAnsi="Arial" w:cs="Arial"/>
+          <w:b/>
+          <w:sz w:val="24"/>
+          <w:szCs w:val="24"/>
+        </w:rPr>
+      </w:pPr>
+      <w:r>
+        <w:rPr>
+          <w:rFonts w:ascii="Arial" w:hAnsi="Arial" w:cs="Arial"/>
+          <w:b/>
+          <w:sz w:val="24"/>
+          <w:szCs w:val="24"/>
+        </w:rPr>
+        <w:t>Informações Básicas</w:t>
+      </w:r>
+    </w:p>
+    <w:p>
+      <w:pPr>
+        <w:rPr>
+          <w:rFonts w:ascii="Arial" w:hAnsi="Arial" w:cs="Arial"/>
+          <w:color w:val="000000" w:themeColor="text1"/>
+          <w:sz w:val="24"/>
+          <w:szCs w:val="24"/>
+        </w:rPr>
+      </w:pPr>
+      <w:r>
+        <w:rPr>
+          <w:rFonts w:ascii="Arial" w:hAnsi="Arial" w:cs="Arial"/>
+          <w:sz w:val="24"/>
+          <w:szCs w:val="24"/>
+        </w:rPr>
+        <w:t>Nº do Processo Administrativo</w:t>
+      </w:r>
+      <w:r>
+        <w:rPr>
+          <w:rFonts w:ascii="Arial" w:hAnsi="Arial" w:cs="Arial"/>
+          <w:sz w:val="24"/>
+          <w:szCs w:val="24"/>
+        </w:rPr>
+        <w:t xml:space="preserve">: </w:t>
+      </w:r>
+      <w:r>
+        <w:rPr>
+          <w:rFonts w:ascii="Arial" w:hAnsi="Arial" w:cs="Arial"/>
+          <w:color w:val="FF0000"/>
+          <w:sz w:val="24"/>
+          <w:szCs w:val="24"/>
+        </w:rPr>
+        <w:t>{{etp_process_number}}</w:t>
+      </w:r>
+      <w:r>
+        <w:rPr>
+          <w:rFonts w:ascii="Arial" w:hAnsi="Arial" w:cs="Arial"/>
+          <w:color w:val="FF0000"/>
+          <w:sz w:val="24"/>
+          <w:szCs w:val="24"/>
+        </w:rPr>
+        <w:t/>
+      </w:r>
+    </w:p>
+    <w:p>
+      <w:pPr>
+        <w:rPr>
+          <w:rFonts w:ascii="Arial" w:hAnsi="Arial" w:cs="Arial"/>
+          <w:sz w:val="24"/>
+          <w:szCs w:val="24"/>
+        </w:rPr>
+      </w:pPr>
+      <w:r>
+        <w:rPr>
+          <w:rFonts w:ascii="Arial" w:hAnsi="Arial" w:cs="Arial"/>
+          <w:sz w:val="24"/>
+          <w:szCs w:val="24"/>
+        </w:rPr>
+        <w:t xml:space="preserve">Unidade requisitante: </w:t>
+      </w:r>
+      <w:r>
+        <w:rPr>
+          <w:rFonts w:ascii="Arial" w:hAnsi="Arial" w:cs="Arial"/>
+          <w:color w:val="000000" w:themeColor="text1"/>
+          <w:sz w:val="24"/>
+          <w:szCs w:val="24"/>
+        </w:rPr>
+        <w:t>SPFI – SETOR DE PLANEJAMENTO FINACEIRO</w:t>
+      </w:r>
+    </w:p>
+    <w:p>
+      <w:pPr>
+        <w:rPr>
+          <w:rFonts w:ascii="Arial" w:hAnsi="Arial" w:cs="Arial"/>
+          <w:sz w:val="24"/>
+          <w:szCs w:val="24"/>
+        </w:rPr>
+      </w:pPr>
+    </w:p>
+    <w:p>
+      <w:pPr>
+        <w:spacing w:line="360" w:lineRule="auto"/>
+        <w:jc w:val="both"/>
+        <w:rPr>
+          <w:rFonts w:ascii="Arial" w:hAnsi="Arial" w:cs="Arial"/>
+          <w:b/>
+          <w:sz w:val="24"/>
+          <w:szCs w:val="24"/>
+        </w:rPr>
+      </w:pPr>
+      <w:r>
+        <w:rPr>
+          <w:rFonts w:ascii="Arial" w:hAnsi="Arial" w:cs="Arial"/>
+          <w:b/>
+          <w:sz w:val="24"/>
+          <w:szCs w:val="24"/>
+        </w:rPr>
+        <w:t>INTRODUÇÃO</w:t>
+      </w:r>
+    </w:p>
+    <w:p>
+      <w:pPr>
+        <w:spacing w:line="360" w:lineRule="auto"/>
+        <w:jc w:val="both"/>
+        <w:rPr>
+          <w:rFonts w:ascii="Arial" w:hAnsi="Arial" w:cs="Arial"/>
+          <w:color w:val="000000" w:themeColor="text1"/>
+          <w:sz w:val="24"/>
+          <w:szCs w:val="24"/>
+        </w:rPr>
+      </w:pPr>
+      <w:r>
+        <w:rPr>
+          <w:rFonts w:ascii="Arial" w:hAnsi="Arial" w:cs="Arial"/>
+          <w:color w:val="000000" w:themeColor="text1"/>
+          <w:sz w:val="24"/>
+          <w:szCs w:val="24"/>
+        </w:rPr>
+        <w:t xml:space="preserve">Contratação de empresa de engenharia </w:t>
+      </w:r>
+      <w:r>
+        <w:rPr>
+          <w:rFonts w:ascii="Arial" w:hAnsi="Arial" w:cs="Arial"/>
+          <w:color w:val="000000" w:themeColor="text1"/>
+          <w:sz w:val="24"/>
+          <w:szCs w:val="24"/>
+        </w:rPr>
+        <w:t xml:space="preserve">para </w:t>
+      </w:r>
+      <w:r>
+        <w:rPr>
+          <w:rFonts w:ascii="Arial" w:hAnsi="Arial" w:cs="Arial"/>
+          <w:color w:val="FF0000"/>
+          <w:sz w:val="24"/>
+          <w:szCs w:val="24"/>
+        </w:rPr>
+        <w:t>{{etp_intro_object}}</w:t>
+      </w:r>
+      <w:r>
+        <w:rPr>
+          <w:rFonts w:ascii="Arial" w:hAnsi="Arial" w:cs="Arial"/>
+          <w:color w:val="000000" w:themeColor="text1"/>
+          <w:sz w:val="24"/>
+          <w:szCs w:val="24"/>
+        </w:rPr>
+        <w:t xml:space="preserve">, sendo a execução desse serviço primordial </w:t>
+      </w:r>
+      <w:r>
+        <w:rPr>
+          <w:rFonts w:ascii="Arial" w:hAnsi="Arial" w:cs="Arial"/>
+          <w:color w:val="000000" w:themeColor="text1"/>
+          <w:sz w:val="24"/>
+          <w:szCs w:val="24"/>
+        </w:rPr>
+        <w:t xml:space="preserve">para </w:t>
+      </w:r>
+      <w:r>
+        <w:rPr>
+          <w:rFonts w:ascii="Arial" w:hAnsi="Arial" w:cs="Arial"/>
+          <w:color w:val="000000" w:themeColor="text1"/>
+          <w:sz w:val="24"/>
+          <w:szCs w:val="24"/>
+        </w:rPr>
+        <w:t>os serviços</w:t>
+      </w:r>
+      <w:r>
+        <w:rPr>
+          <w:rFonts w:ascii="Arial" w:hAnsi="Arial" w:cs="Arial"/>
+          <w:color w:val="000000" w:themeColor="text1"/>
+          <w:sz w:val="24"/>
+          <w:szCs w:val="24"/>
+        </w:rPr>
+        <w:t xml:space="preserve"> a ser</w:t>
+      </w:r>
+      <w:r>
+        <w:rPr>
+          <w:rFonts w:ascii="Arial" w:hAnsi="Arial" w:cs="Arial"/>
+          <w:color w:val="000000" w:themeColor="text1"/>
+          <w:sz w:val="24"/>
+          <w:szCs w:val="24"/>
+        </w:rPr>
+        <w:t>em</w:t>
+      </w:r>
+      <w:r>
+        <w:rPr>
+          <w:rFonts w:ascii="Arial" w:hAnsi="Arial" w:cs="Arial"/>
+          <w:color w:val="000000" w:themeColor="text1"/>
+          <w:sz w:val="24"/>
+          <w:szCs w:val="24"/>
+        </w:rPr>
+        <w:t xml:space="preserve"> realizado</w:t>
+      </w:r>
+      <w:r>
+        <w:rPr>
+          <w:rFonts w:ascii="Arial" w:hAnsi="Arial" w:cs="Arial"/>
+          <w:color w:val="000000" w:themeColor="text1"/>
+          <w:sz w:val="24"/>
+          <w:szCs w:val="24"/>
+        </w:rPr>
+        <w:t>s</w:t>
+      </w:r>
+      <w:r>
+        <w:rPr>
+          <w:rFonts w:ascii="Arial" w:hAnsi="Arial" w:cs="Arial"/>
+          <w:color w:val="000000" w:themeColor="text1"/>
+          <w:sz w:val="24"/>
+          <w:szCs w:val="24"/>
+        </w:rPr>
+        <w:t xml:space="preserve"> conforme o Estudo Técnico Preliminar de Contratação</w:t>
+      </w:r>
+      <w:r>
+        <w:rPr>
+          <w:rFonts w:ascii="Arial" w:hAnsi="Arial" w:cs="Arial"/>
+          <w:color w:val="000000" w:themeColor="text1"/>
+          <w:sz w:val="24"/>
+          <w:szCs w:val="24"/>
+        </w:rPr>
+        <w:t>.</w:t>
+      </w:r>
+    </w:p>
+    <w:p>
+      <w:pPr>
+        <w:spacing w:line="360" w:lineRule="auto"/>
+        <w:jc w:val="both"/>
+        <w:rPr>
+          <w:rFonts w:ascii="Arial" w:hAnsi="Arial" w:cs="Arial"/>
+          <w:sz w:val="24"/>
+          <w:szCs w:val="24"/>
+        </w:rPr>
+      </w:pPr>
+    </w:p>
+    <w:p>
+      <w:pPr>
+        <w:spacing w:line="360" w:lineRule="auto"/>
+        <w:jc w:val="both"/>
+        <w:rPr>
+          <w:rFonts w:ascii="Arial" w:hAnsi="Arial" w:cs="Arial"/>
+          <w:b/>
+          <w:sz w:val="24"/>
+          <w:szCs w:val="24"/>
+        </w:rPr>
+      </w:pPr>
+      <w:r>
+        <w:rPr>
+          <w:rFonts w:ascii="Arial" w:hAnsi="Arial" w:cs="Arial"/>
+          <w:b/>
+          <w:sz w:val="24"/>
+          <w:szCs w:val="24"/>
+        </w:rPr>
+        <w:t>1 - DESCRIÇÃO DA NECESSIDADE</w:t>
+      </w:r>
+    </w:p>
+    <w:p>
+      <w:pPr>
+        <w:shd w:val="clear" w:color="auto" w:fill="FFFFFF"/>
+        <w:spacing w:line="360" w:lineRule="auto"/>
+        <w:jc w:val="both"/>
+        <w:textAlignment w:val="baseline"/>
+        <w:rPr>
+          <w:rFonts w:ascii="Arial" w:hAnsi="Arial" w:cs="Arial"/>
+          <w:color w:val="FF0000"/>
+          <w:sz w:val="24"/>
+          <w:szCs w:val="24"/>
+        </w:rPr>
+      </w:pPr>
+      <w:r>
+        <w:rPr>
+          <w:rFonts w:ascii="Arial" w:hAnsi="Arial" w:cs="Arial"/>
+          <w:color w:val="FF0000"/>
+          <w:sz w:val="24"/>
+          <w:szCs w:val="24"/>
+        </w:rPr>
+        <w:t>{{etp_need_object}}</w:t>
+      </w:r>
+      <w:r>
+        <w:rPr>
+          <w:rFonts w:ascii="Arial" w:hAnsi="Arial" w:cs="Arial"/>
+          <w:color w:val="FF0000"/>
+          <w:sz w:val="24"/>
+          <w:szCs w:val="24"/>
+        </w:rPr>
+        <w:t xml:space="preserve"/>
+      </w:r>
+      <w:r>
+        <w:rPr>
+          <w:rFonts w:ascii="Arial" w:hAnsi="Arial" w:cs="Arial"/>
+          <w:color w:val="FF0000"/>
+          <w:sz w:val="24"/>
+          <w:szCs w:val="24"/>
+        </w:rPr>
+        <w:t xml:space="preserve"/>
+      </w:r>
+      <w:r>
+        <w:rPr>
+          <w:rFonts w:ascii="Arial" w:hAnsi="Arial" w:cs="Arial"/>
+          <w:color w:val="FF0000"/>
+          <w:sz w:val="24"/>
+          <w:szCs w:val="24"/>
+        </w:rPr>
+        <w:t/>
+      </w:r>
+      <w:r>
+        <w:rPr>
+          <w:rFonts w:ascii="Arial" w:hAnsi="Arial" w:cs="Arial"/>
+          <w:color w:val="FF0000"/>
+          <w:sz w:val="24"/>
+          <w:szCs w:val="24"/>
+        </w:rPr>
+        <w:t/>
+      </w:r>
+    </w:p>
+    <w:p>
+      <w:pPr>
+        <w:shd w:val="clear" w:color="auto" w:fill="FFFFFF"/>
+        <w:spacing w:line="360" w:lineRule="auto"/>
+        <w:jc w:val="both"/>
+        <w:textAlignment w:val="baseline"/>
+        <w:rPr>
+          <w:rFonts w:ascii="Arial" w:hAnsi="Arial" w:cs="Arial"/>
+          <w:color w:val="FF0000"/>
+          <w:sz w:val="24"/>
+          <w:szCs w:val="24"/>
+        </w:rPr>
+      </w:pPr>
+      <w:r>
+        <w:rPr>
+          <w:rFonts w:ascii="Arial" w:hAnsi="Arial" w:cs="Arial"/>
+          <w:color w:val="FF0000"/>
+          <w:sz w:val="24"/>
+          <w:szCs w:val="24"/>
+        </w:rPr>
+        <w:t>{{etp_need_justification}}</w:t>
+      </w:r>
+      <w:r>
+        <w:rPr>
+          <w:rFonts w:ascii="Arial" w:hAnsi="Arial" w:cs="Arial"/>
+          <w:color w:val="FF0000"/>
+          <w:sz w:val="24"/>
+          <w:szCs w:val="24"/>
+        </w:rPr>
+        <w:t xml:space="preserve"/>
+      </w:r>
+      <w:proofErr w:type="gramStart"/>
+      <w:r>
+        <w:rPr>
+          <w:rFonts w:ascii="Arial" w:hAnsi="Arial" w:cs="Arial"/>
+          <w:color w:val="FF0000"/>
+          <w:sz w:val="24"/>
+          <w:szCs w:val="24"/>
+        </w:rPr>
+        <w:t xml:space="preserve"/>
+      </w:r>
+      <w:r>
+        <w:rPr>
+          <w:rFonts w:ascii="Arial" w:hAnsi="Arial" w:cs="Arial"/>
+          <w:color w:val="FF0000"/>
+          <w:sz w:val="24"/>
+          <w:szCs w:val="24"/>
+        </w:rPr>
+        <w:t xml:space="preserve"/>
+      </w:r>
+      <w:proofErr w:type="gramEnd"/>
+      <w:r>
+        <w:rPr>
+          <w:rFonts w:ascii="Arial" w:hAnsi="Arial" w:cs="Arial"/>
+          <w:color w:val="FF0000"/>
+          <w:sz w:val="24"/>
+          <w:szCs w:val="24"/>
+        </w:rPr>
+        <w:t xml:space="preserve"/>
+      </w:r>
+      <w:r>
+        <w:rPr>
+          <w:rFonts w:ascii="Arial" w:hAnsi="Arial" w:cs="Arial"/>
+          <w:color w:val="FF0000"/>
+          <w:sz w:val="24"/>
+          <w:szCs w:val="24"/>
+        </w:rPr>
+        <w:lastRenderedPageBreak/>
+        <w:t/>
+      </w:r>
+    </w:p>
+    <w:p>
+      <w:pPr>
+        <w:shd w:val="clear" w:color="auto" w:fill="FFFFFF"/>
+        <w:spacing w:line="360" w:lineRule="auto"/>
+        <w:jc w:val="both"/>
+        <w:textAlignment w:val="baseline"/>
+        <w:rPr>
+          <w:rFonts w:ascii="Arial" w:hAnsi="Arial" w:cs="Arial"/>
+          <w:color w:val="FF0000"/>
+          <w:sz w:val="24"/>
+          <w:szCs w:val="24"/>
+        </w:rPr>
+      </w:pPr>
+      <w:r>
+        <w:rPr>
+          <w:rFonts w:ascii="Arial" w:hAnsi="Arial" w:cs="Arial"/>
+          <w:color w:val="FF0000"/>
+          <w:sz w:val="24"/>
+          <w:szCs w:val="24"/>
+        </w:rPr>
+        <w:t>{{etp_need_plan}}</w:t>
+      </w:r>
+    </w:p>
+    <w:p>
+      <w:pPr>
+        <w:shd w:val="clear" w:color="auto" w:fill="FFFFFF"/>
+        <w:spacing w:line="360" w:lineRule="auto"/>
+        <w:jc w:val="both"/>
+        <w:textAlignment w:val="baseline"/>
+        <w:rPr>
+          <w:rFonts w:ascii="Arial" w:hAnsi="Arial" w:cs="Arial"/>
+          <w:color w:val="FF0000"/>
+          <w:sz w:val="24"/>
+          <w:szCs w:val="24"/>
+        </w:rPr>
+      </w:pPr>
+    </w:p>
+    <w:p>
+      <w:pPr>
+        <w:pStyle w:val="PargrafodaLista"/>
+        <w:shd w:val="clear" w:color="auto" w:fill="FFFFFF"/>
+        <w:spacing w:line="360" w:lineRule="auto"/>
+        <w:ind w:left="0"/>
+        <w:jc w:val="both"/>
+        <w:textAlignment w:val="baseline"/>
+        <w:rPr>
+          <w:rFonts w:ascii="Arial" w:hAnsi="Arial" w:cs="Arial"/>
+          <w:b/>
+          <w:bCs/>
+          <w:sz w:val="24"/>
+          <w:szCs w:val="24"/>
+        </w:rPr>
+      </w:pPr>
+      <w:r>
+        <w:rPr>
+          <w:rFonts w:ascii="Arial" w:hAnsi="Arial" w:cs="Arial"/>
+          <w:b/>
+          <w:bCs/>
+          <w:sz w:val="24"/>
+          <w:szCs w:val="24"/>
+        </w:rPr>
+        <w:t xml:space="preserve">2 - </w:t>
+      </w:r>
+      <w:r>
+        <w:rPr>
+          <w:rFonts w:ascii="Arial" w:hAnsi="Arial" w:cs="Arial"/>
+          <w:b/>
+          <w:bCs/>
+          <w:sz w:val="24"/>
+          <w:szCs w:val="24"/>
+        </w:rPr>
+        <w:t>PREVISÃO NO PLANO DE CONTRATAÇÕES ANUAL</w:t>
+      </w:r>
+    </w:p>
+    <w:p>
+      <w:pPr>
+        <w:shd w:val="clear" w:color="auto" w:fill="FFFFFF"/>
+        <w:spacing w:line="360" w:lineRule="auto"/>
+        <w:jc w:val="both"/>
+        <w:textAlignment w:val="baseline"/>
+        <w:rPr>
+          <w:rFonts w:ascii="Arial" w:hAnsi="Arial" w:cs="Arial"/>
+          <w:sz w:val="24"/>
+          <w:szCs w:val="24"/>
+        </w:rPr>
+      </w:pPr>
+      <w:r>
+        <w:rPr>
+          <w:rFonts w:ascii="Arial" w:hAnsi="Arial" w:cs="Arial"/>
+          <w:sz w:val="24"/>
+          <w:szCs w:val="24"/>
+        </w:rPr>
+        <w:t>As despesas relativas à contrapartida onerarão a seguinte dotação orçamentária:</w:t>
+      </w:r>
+    </w:p>
+    <w:p>
+      <w:pPr>
+        <w:pStyle w:val="PargrafodaLista"/>
+        <w:numPr>
+          <w:ilvl w:val="0"/>
+          <w:numId w:val="3"/>
+        </w:numPr>
+        <w:shd w:val="clear" w:color="auto" w:fill="FFFFFF"/>
+        <w:spacing w:line="360" w:lineRule="auto"/>
+        <w:jc w:val="both"/>
+        <w:textAlignment w:val="baseline"/>
+        <w:rPr>
+          <w:rFonts w:ascii="Arial" w:hAnsi="Arial" w:cs="Arial"/>
+          <w:color w:val="FF0000"/>
+          <w:sz w:val="24"/>
+          <w:szCs w:val="24"/>
+        </w:rPr>
+      </w:pPr>
+      <w:r>
+        <w:rPr>
+          <w:rFonts w:ascii="Arial" w:hAnsi="Arial" w:cs="Arial"/>
+          <w:color w:val="FF0000"/>
+          <w:sz w:val="24"/>
+          <w:szCs w:val="24"/>
+        </w:rPr>
+        <w:t xml:space="preserve">{{etp_budget_allocation}}</w:t>
+      </w:r>
+      <w:r>
+        <w:rPr>
+          <w:rFonts w:ascii="Arial" w:hAnsi="Arial" w:cs="Arial"/>
+          <w:color w:val="FF0000"/>
+          <w:sz w:val="24"/>
+          <w:szCs w:val="24"/>
+        </w:rPr>
+        <w:t/>
+      </w:r>
+      <w:r>
+        <w:rPr>
+          <w:rFonts w:ascii="Arial" w:hAnsi="Arial" w:cs="Arial"/>
+          <w:color w:val="FF0000"/>
+          <w:sz w:val="24"/>
+          <w:szCs w:val="24"/>
+        </w:rPr>
+        <w:t xml:space="preserve"/>
+      </w:r>
+      <w:r>
+        <w:rPr>
+          <w:rFonts w:ascii="Arial" w:hAnsi="Arial" w:cs="Arial"/>
+          <w:color w:val="FF0000"/>
+          <w:sz w:val="24"/>
+          <w:szCs w:val="24"/>
+        </w:rPr>
+        <w:t/>
+      </w:r>
+    </w:p>
+    <w:p>
+      <w:pPr>
+        <w:shd w:val="clear" w:color="auto" w:fill="FFFFFF"/>
+        <w:spacing w:line="360" w:lineRule="auto"/>
+        <w:jc w:val="both"/>
+        <w:textAlignment w:val="baseline"/>
+        <w:rPr>
+          <w:rFonts w:ascii="Arial" w:hAnsi="Arial" w:cs="Arial"/>
+          <w:sz w:val="24"/>
+          <w:szCs w:val="24"/>
+        </w:rPr>
+      </w:pPr>
+    </w:p>
+    <w:p>
+      <w:pPr>
+        <w:spacing w:line="360" w:lineRule="auto"/>
+        <w:jc w:val="both"/>
+        <w:rPr>
+          <w:rFonts w:ascii="Arial" w:hAnsi="Arial" w:cs="Arial"/>
+          <w:b/>
+          <w:bCs/>
+          <w:color w:val="000000"/>
+          <w:sz w:val="24"/>
+          <w:szCs w:val="24"/>
+        </w:rPr>
+      </w:pPr>
+      <w:r>
+        <w:rPr>
+          <w:rFonts w:ascii="Arial" w:hAnsi="Arial" w:cs="Arial"/>
+          <w:b/>
+          <w:bCs/>
+          <w:sz w:val="24"/>
+          <w:szCs w:val="24"/>
+        </w:rPr>
+        <w:t xml:space="preserve">3 – REQUISITOS </w:t>
+      </w:r>
+      <w:r>
+        <w:rPr>
+          <w:rFonts w:ascii="Arial" w:hAnsi="Arial" w:cs="Arial"/>
+          <w:b/>
+          <w:bCs/>
+          <w:color w:val="000000"/>
+          <w:sz w:val="24"/>
+          <w:szCs w:val="24"/>
+        </w:rPr>
+        <w:t>DA CONTRATAÇÃO</w:t>
+      </w:r>
+      <w:r>
+        <w:rPr>
+          <w:rFonts w:ascii="Arial" w:hAnsi="Arial" w:cs="Arial"/>
+          <w:b/>
+          <w:bCs/>
+          <w:color w:val="000000"/>
+          <w:sz w:val="24"/>
+          <w:szCs w:val="24"/>
+        </w:rPr>
+        <w:t xml:space="preserve"> </w:t>
+      </w:r>
+    </w:p>
+    <w:p>
+      <w:pPr>
+        <w:spacing w:line="360" w:lineRule="auto"/>
+        <w:jc w:val="both"/>
+        <w:rPr>
+          <w:rFonts w:ascii="Arial" w:hAnsi="Arial" w:cs="Arial"/>
+          <w:bCs/>
+          <w:color w:val="000000"/>
+          <w:sz w:val="24"/>
+          <w:szCs w:val="24"/>
+        </w:rPr>
+      </w:pPr>
+      <w:r>
+        <w:rPr>
+          <w:rFonts w:ascii="Arial" w:hAnsi="Arial" w:cs="Arial"/>
+          <w:bCs/>
+          <w:color w:val="000000"/>
+          <w:sz w:val="24"/>
+          <w:szCs w:val="24"/>
+        </w:rPr>
+        <w:t>3</w:t>
+      </w:r>
+      <w:r>
+        <w:rPr>
+          <w:rFonts w:ascii="Arial" w:hAnsi="Arial" w:cs="Arial"/>
+          <w:bCs/>
+          <w:color w:val="000000"/>
+          <w:sz w:val="24"/>
+          <w:szCs w:val="24"/>
+        </w:rPr>
+        <w:t>.1 - Lei nº 14.133, de 1º de abril de 2021</w:t>
+      </w:r>
+      <w:r>
+        <w:rPr>
+          <w:rFonts w:ascii="Arial" w:hAnsi="Arial" w:cs="Arial"/>
+          <w:bCs/>
+          <w:color w:val="000000"/>
+          <w:sz w:val="24"/>
+          <w:szCs w:val="24"/>
+        </w:rPr>
+        <w:t>, Lei de Licitações e Contratos Administrativos;</w:t>
+      </w:r>
+    </w:p>
+    <w:p>
+      <w:pPr>
+        <w:rPr>
+          <w:rFonts w:ascii="Arial" w:hAnsi="Arial" w:cs="Arial"/>
+          <w:bCs/>
+          <w:color w:val="000000"/>
+          <w:sz w:val="24"/>
+          <w:szCs w:val="24"/>
+        </w:rPr>
+      </w:pPr>
+      <w:r>
+        <w:rPr>
+          <w:rFonts w:ascii="Arial" w:hAnsi="Arial" w:cs="Arial"/>
+          <w:bCs/>
+          <w:color w:val="000000"/>
+          <w:sz w:val="24"/>
+          <w:szCs w:val="24"/>
+        </w:rPr>
+        <w:t>3</w:t>
+      </w:r>
+      <w:r>
+        <w:rPr>
+          <w:rFonts w:ascii="Arial" w:hAnsi="Arial" w:cs="Arial"/>
+          <w:bCs/>
+          <w:color w:val="000000"/>
+          <w:sz w:val="24"/>
+          <w:szCs w:val="24"/>
+        </w:rPr>
+        <w:t>.2 - Normas da ABNT e das legislações pertin</w:t>
+      </w:r>
+      <w:r>
+        <w:rPr>
+          <w:rFonts w:ascii="Arial" w:hAnsi="Arial" w:cs="Arial"/>
+          <w:bCs/>
+          <w:color w:val="000000"/>
+          <w:sz w:val="24"/>
+          <w:szCs w:val="24"/>
+        </w:rPr>
+        <w:t xml:space="preserve">entes para execução de todos os </w:t>
+      </w:r>
+      <w:r>
+        <w:rPr>
+          <w:rFonts w:ascii="Arial" w:hAnsi="Arial" w:cs="Arial"/>
+          <w:bCs/>
+          <w:color w:val="000000"/>
+          <w:sz w:val="24"/>
+          <w:szCs w:val="24"/>
+        </w:rPr>
+        <w:t>serviços aplicáveis na execução da obra, inclusi</w:t>
+      </w:r>
+      <w:r>
+        <w:rPr>
+          <w:rFonts w:ascii="Arial" w:hAnsi="Arial" w:cs="Arial"/>
+          <w:bCs/>
+          <w:color w:val="000000"/>
+          <w:sz w:val="24"/>
+          <w:szCs w:val="24"/>
+        </w:rPr>
+        <w:t xml:space="preserve">ve no que tange a qualidade dos </w:t>
+      </w:r>
+      <w:r>
+        <w:rPr>
+          <w:rFonts w:ascii="Arial" w:hAnsi="Arial" w:cs="Arial"/>
+          <w:bCs/>
+          <w:color w:val="000000"/>
+          <w:sz w:val="24"/>
+          <w:szCs w:val="24"/>
+        </w:rPr>
+        <w:t xml:space="preserve">materiais; </w:t>
+      </w:r>
+    </w:p>
+    <w:p>
+      <w:pPr>
+        <w:spacing w:line="360" w:lineRule="auto"/>
+        <w:jc w:val="both"/>
+        <w:rPr>
+          <w:rFonts w:ascii="Arial" w:hAnsi="Arial" w:cs="Arial"/>
+          <w:bCs/>
+          <w:color w:val="000000"/>
+          <w:sz w:val="24"/>
+          <w:szCs w:val="24"/>
+        </w:rPr>
+      </w:pPr>
+      <w:r>
+        <w:rPr>
+          <w:rFonts w:ascii="Arial" w:hAnsi="Arial" w:cs="Arial"/>
+          <w:bCs/>
+          <w:color w:val="000000"/>
+          <w:sz w:val="24"/>
+          <w:szCs w:val="24"/>
+        </w:rPr>
+        <w:lastRenderedPageBreak/>
+        <w:t>3</w:t>
+      </w:r>
+      <w:r>
+        <w:rPr>
+          <w:rFonts w:ascii="Arial" w:hAnsi="Arial" w:cs="Arial"/>
+          <w:bCs/>
+          <w:color w:val="000000"/>
+          <w:sz w:val="24"/>
+          <w:szCs w:val="24"/>
+        </w:rPr>
+        <w:t>.</w:t>
+      </w:r>
+      <w:r>
+        <w:rPr>
+          <w:rFonts w:ascii="Arial" w:hAnsi="Arial" w:cs="Arial"/>
+          <w:bCs/>
+          <w:color w:val="000000"/>
+          <w:sz w:val="24"/>
+          <w:szCs w:val="24"/>
+        </w:rPr>
+        <w:t>3</w:t>
+      </w:r>
+      <w:r>
+        <w:rPr>
+          <w:rFonts w:ascii="Arial" w:hAnsi="Arial" w:cs="Arial"/>
+          <w:bCs/>
+          <w:color w:val="000000"/>
+          <w:sz w:val="24"/>
+          <w:szCs w:val="24"/>
+        </w:rPr>
+        <w:t xml:space="preserve"> - Resolução CONAMA nº 307, de 05 de julho de 2002, que estabelece diretrizes,</w:t>
+      </w:r>
+      <w:r>
+        <w:rPr>
+          <w:rFonts w:ascii="Arial" w:hAnsi="Arial" w:cs="Arial"/>
+          <w:bCs/>
+          <w:color w:val="000000"/>
+          <w:sz w:val="24"/>
+          <w:szCs w:val="24"/>
+        </w:rPr>
+        <w:t xml:space="preserve"> </w:t>
+      </w:r>
+      <w:r>
+        <w:rPr>
+          <w:rFonts w:ascii="Arial" w:hAnsi="Arial" w:cs="Arial"/>
+          <w:bCs/>
+          <w:color w:val="000000"/>
+          <w:sz w:val="24"/>
+          <w:szCs w:val="24"/>
+        </w:rPr>
+        <w:t>critérios e procedimentos para a gestão dos resíduos da construção civil.</w:t>
+      </w:r>
+    </w:p>
+    <w:p>
+      <w:pPr>
+        <w:spacing w:line="360" w:lineRule="auto"/>
+        <w:jc w:val="both"/>
+        <w:rPr>
+          <w:rFonts w:ascii="Arial" w:hAnsi="Arial" w:cs="Arial"/>
+          <w:bCs/>
+          <w:color w:val="000000"/>
+          <w:sz w:val="24"/>
+          <w:szCs w:val="24"/>
+        </w:rPr>
+      </w:pPr>
+      <w:r>
+        <w:rPr>
+          <w:rFonts w:ascii="Arial" w:hAnsi="Arial" w:cs="Arial"/>
+          <w:bCs/>
+          <w:color w:val="000000"/>
+          <w:sz w:val="24"/>
+          <w:szCs w:val="24"/>
+        </w:rPr>
+        <w:t>3</w:t>
+      </w:r>
+      <w:r>
+        <w:rPr>
+          <w:rFonts w:ascii="Arial" w:hAnsi="Arial" w:cs="Arial"/>
+          <w:bCs/>
+          <w:color w:val="000000"/>
+          <w:sz w:val="24"/>
+          <w:szCs w:val="24"/>
+        </w:rPr>
+        <w:t>.</w:t>
+      </w:r>
+      <w:r>
+        <w:rPr>
+          <w:rFonts w:ascii="Arial" w:hAnsi="Arial" w:cs="Arial"/>
+          <w:bCs/>
+          <w:color w:val="000000"/>
+          <w:sz w:val="24"/>
+          <w:szCs w:val="24"/>
+        </w:rPr>
+        <w:t>4</w:t>
+      </w:r>
+      <w:r>
+        <w:rPr>
+          <w:rFonts w:ascii="Arial" w:hAnsi="Arial" w:cs="Arial"/>
+          <w:bCs/>
+          <w:color w:val="000000"/>
+          <w:sz w:val="24"/>
+          <w:szCs w:val="24"/>
+        </w:rPr>
+        <w:t xml:space="preserve"> - Os serviços serão prestados por empresa esp</w:t>
+      </w:r>
+      <w:r>
+        <w:rPr>
+          <w:rFonts w:ascii="Arial" w:hAnsi="Arial" w:cs="Arial"/>
+          <w:bCs/>
+          <w:color w:val="000000"/>
+          <w:sz w:val="24"/>
+          <w:szCs w:val="24"/>
+        </w:rPr>
+        <w:t xml:space="preserve">ecializada no ramo, devidamente </w:t>
+      </w:r>
+      <w:r>
+        <w:rPr>
+          <w:rFonts w:ascii="Arial" w:hAnsi="Arial" w:cs="Arial"/>
+          <w:bCs/>
+          <w:color w:val="000000"/>
+          <w:sz w:val="24"/>
+          <w:szCs w:val="24"/>
+        </w:rPr>
+        <w:t>regulamentada e autorizada pelos órgãos com</w:t>
+      </w:r>
+      <w:r>
+        <w:rPr>
+          <w:rFonts w:ascii="Arial" w:hAnsi="Arial" w:cs="Arial"/>
+          <w:bCs/>
+          <w:color w:val="000000"/>
+          <w:sz w:val="24"/>
+          <w:szCs w:val="24"/>
+        </w:rPr>
+        <w:t xml:space="preserve">petentes, em conformidade com a </w:t>
+      </w:r>
+      <w:r>
+        <w:rPr>
+          <w:rFonts w:ascii="Arial" w:hAnsi="Arial" w:cs="Arial"/>
+          <w:bCs/>
+          <w:color w:val="000000"/>
+          <w:sz w:val="24"/>
+          <w:szCs w:val="24"/>
+        </w:rPr>
+        <w:t>legislação vigente e padrões de sustentabilidade exigidos nesse instrum</w:t>
+      </w:r>
+      <w:r>
+        <w:rPr>
+          <w:rFonts w:ascii="Arial" w:hAnsi="Arial" w:cs="Arial"/>
+          <w:bCs/>
+          <w:color w:val="000000"/>
+          <w:sz w:val="24"/>
+          <w:szCs w:val="24"/>
+        </w:rPr>
+        <w:t xml:space="preserve">ento e no </w:t>
+      </w:r>
+      <w:r>
+        <w:rPr>
+          <w:rFonts w:ascii="Arial" w:hAnsi="Arial" w:cs="Arial"/>
+          <w:bCs/>
+          <w:color w:val="000000"/>
+          <w:sz w:val="24"/>
+          <w:szCs w:val="24"/>
+        </w:rPr>
+        <w:t>termo de referência.</w:t>
+      </w:r>
+    </w:p>
+    <w:p>
+      <w:pPr>
+        <w:spacing w:line="360" w:lineRule="auto"/>
+        <w:jc w:val="both"/>
+        <w:rPr>
+          <w:rFonts w:ascii="Arial" w:hAnsi="Arial" w:cs="Arial"/>
+          <w:bCs/>
+          <w:color w:val="000000"/>
+          <w:sz w:val="24"/>
+          <w:szCs w:val="24"/>
+        </w:rPr>
+      </w:pPr>
+      <w:r>
+        <w:rPr>
+          <w:rFonts w:ascii="Arial" w:hAnsi="Arial" w:cs="Arial"/>
+          <w:bCs/>
+          <w:color w:val="000000"/>
+          <w:sz w:val="24"/>
+          <w:szCs w:val="24"/>
+        </w:rPr>
+        <w:t xml:space="preserve">3.5 – </w:t>
+      </w:r>
+      <w:r>
+        <w:rPr>
+          <w:rFonts w:ascii="Arial" w:hAnsi="Arial" w:cs="Arial"/>
+          <w:bCs/>
+          <w:color w:val="000000"/>
+          <w:sz w:val="24"/>
+          <w:szCs w:val="24"/>
+        </w:rPr>
+        <w:t>Para prestação dos serviços pretendidos os eventuais interessados deverão</w:t>
+      </w:r>
+      <w:r>
+        <w:rPr>
+          <w:rFonts w:ascii="Arial" w:hAnsi="Arial" w:cs="Arial"/>
+          <w:bCs/>
+          <w:color w:val="000000"/>
+          <w:sz w:val="24"/>
+          <w:szCs w:val="24"/>
+        </w:rPr>
+        <w:t xml:space="preserve"> </w:t>
+      </w:r>
+      <w:r>
+        <w:rPr>
+          <w:rFonts w:ascii="Arial" w:hAnsi="Arial" w:cs="Arial"/>
+          <w:bCs/>
+          <w:color w:val="000000"/>
+          <w:sz w:val="24"/>
+          <w:szCs w:val="24"/>
+        </w:rPr>
+        <w:t>comprovar que atuam em ramo de atividade compatível com o objeto da licitação, bem</w:t>
+      </w:r>
+      <w:r>
+        <w:rPr>
+          <w:rFonts w:ascii="Arial" w:hAnsi="Arial" w:cs="Arial"/>
+          <w:bCs/>
+          <w:color w:val="000000"/>
+          <w:sz w:val="24"/>
+          <w:szCs w:val="24"/>
+        </w:rPr>
+        <w:t xml:space="preserve"> </w:t>
+      </w:r>
+      <w:r>
+        <w:rPr>
+          <w:rFonts w:ascii="Arial" w:hAnsi="Arial" w:cs="Arial"/>
+          <w:bCs/>
+          <w:color w:val="000000"/>
+          <w:sz w:val="24"/>
+          <w:szCs w:val="24"/>
+        </w:rPr>
+        <w:t>como apresentar os seguintes documentos a título qualificação técnica, nos termos do</w:t>
+      </w:r>
+      <w:r>
+        <w:rPr>
+          <w:rFonts w:ascii="Arial" w:hAnsi="Arial" w:cs="Arial"/>
+          <w:bCs/>
+          <w:color w:val="000000"/>
+          <w:sz w:val="24"/>
+          <w:szCs w:val="24"/>
+        </w:rPr>
+        <w:t xml:space="preserve"> </w:t>
+      </w:r>
+      <w:r>
+        <w:rPr>
+          <w:rFonts w:ascii="Arial" w:hAnsi="Arial" w:cs="Arial"/>
+          <w:bCs/>
+          <w:color w:val="000000"/>
+          <w:sz w:val="24"/>
+          <w:szCs w:val="24"/>
+        </w:rPr>
+        <w:t>art. 62, inciso II,</w:t>
+      </w:r>
+      <w:r>
+        <w:rPr>
+          <w:rFonts w:ascii="Arial" w:hAnsi="Arial" w:cs="Arial"/>
+          <w:bCs/>
+          <w:color w:val="000000"/>
+          <w:sz w:val="24"/>
+          <w:szCs w:val="24"/>
+        </w:rPr>
+        <w:t xml:space="preserve"> da Lei Federal nº 14.133/2021;</w:t>
+      </w:r>
+    </w:p>
+    <w:p>
+      <w:pPr>
+        <w:spacing w:line="360" w:lineRule="auto"/>
+        <w:jc w:val="both"/>
+        <w:rPr>
+          <w:rFonts w:ascii="Arial" w:hAnsi="Arial" w:cs="Arial"/>
+          <w:bCs/>
+          <w:color w:val="000000"/>
+          <w:sz w:val="24"/>
+          <w:szCs w:val="24"/>
+        </w:rPr>
+      </w:pPr>
+      <w:r>
+        <w:rPr>
+          <w:rFonts w:ascii="Arial" w:hAnsi="Arial" w:cs="Arial"/>
+          <w:bCs/>
+          <w:color w:val="000000"/>
+          <w:sz w:val="24"/>
+          <w:szCs w:val="24"/>
+        </w:rPr>
+        <w:t>3</w:t>
+      </w:r>
+      <w:r>
+        <w:rPr>
+          <w:rFonts w:ascii="Arial" w:hAnsi="Arial" w:cs="Arial"/>
+          <w:bCs/>
+          <w:color w:val="000000"/>
+          <w:sz w:val="24"/>
+          <w:szCs w:val="24"/>
+        </w:rPr>
+        <w:t>.</w:t>
+      </w:r>
+      <w:r>
+        <w:rPr>
+          <w:rFonts w:ascii="Arial" w:hAnsi="Arial" w:cs="Arial"/>
+          <w:bCs/>
+          <w:color w:val="000000"/>
+          <w:sz w:val="24"/>
+          <w:szCs w:val="24"/>
+        </w:rPr>
+        <w:t>6</w:t>
+      </w:r>
+      <w:r>
+        <w:rPr>
+          <w:rFonts w:ascii="Arial" w:hAnsi="Arial" w:cs="Arial"/>
+          <w:bCs/>
+          <w:color w:val="000000"/>
+          <w:sz w:val="24"/>
+          <w:szCs w:val="24"/>
+        </w:rPr>
+        <w:t xml:space="preserve"> - A prestação dos serviços não gera vínculo empr</w:t>
+      </w:r>
+      <w:r>
+        <w:rPr>
+          <w:rFonts w:ascii="Arial" w:hAnsi="Arial" w:cs="Arial"/>
+          <w:bCs/>
+          <w:color w:val="000000"/>
+          <w:sz w:val="24"/>
+          <w:szCs w:val="24"/>
+        </w:rPr>
+        <w:t xml:space="preserve">egatício entre os empregados da </w:t>
+      </w:r>
+      <w:r>
+        <w:rPr>
+          <w:rFonts w:ascii="Arial" w:hAnsi="Arial" w:cs="Arial"/>
+          <w:bCs/>
+          <w:color w:val="000000"/>
+          <w:sz w:val="24"/>
+          <w:szCs w:val="24"/>
+        </w:rPr>
+        <w:t>Contratada e a Administração, vedando-se q</w:t>
+      </w:r>
+      <w:r>
+        <w:rPr>
+          <w:rFonts w:ascii="Arial" w:hAnsi="Arial" w:cs="Arial"/>
+          <w:bCs/>
+          <w:color w:val="000000"/>
+          <w:sz w:val="24"/>
+          <w:szCs w:val="24"/>
+        </w:rPr>
+        <w:t xml:space="preserve">ualquer relação entre estes que </w:t>
+      </w:r>
+      <w:r>
+        <w:rPr>
+          <w:rFonts w:ascii="Arial" w:hAnsi="Arial" w:cs="Arial"/>
+          <w:bCs/>
+          <w:color w:val="000000"/>
+          <w:sz w:val="24"/>
+          <w:szCs w:val="24"/>
+        </w:rPr>
+        <w:t>caracterize pessoalidade e subordinação direta.</w:t>
+      </w:r>
+      <w:r>
+        <w:rPr>
+          <w:rFonts w:ascii="Arial" w:hAnsi="Arial" w:cs="Arial"/>
+          <w:b/>
+          <w:bCs/>
+          <w:color w:val="000000"/>
+          <w:sz w:val="24"/>
+          <w:szCs w:val="24"/>
+        </w:rPr>
+        <w:tab/>
+      </w:r>
+    </w:p>
+    <w:p>
+      <w:pPr>
+        <w:spacing w:line="360" w:lineRule="auto"/>
+        <w:jc w:val="both"/>
+        <w:rPr>
+          <w:rFonts w:ascii="Arial" w:hAnsi="Arial" w:cs="Arial"/>
+          <w:b/>
+          <w:bCs/>
+          <w:color w:val="000000"/>
+          <w:sz w:val="24"/>
+          <w:szCs w:val="24"/>
+        </w:rPr>
+      </w:pPr>
+    </w:p>
+    <w:p>
+      <w:pPr>
+        <w:spacing w:line="360" w:lineRule="auto"/>
+        <w:jc w:val="both"/>
+        <w:rPr>
+          <w:rFonts w:ascii="Arial" w:hAnsi="Arial" w:cs="Arial"/>
+          <w:b/>
+          <w:bCs/>
+          <w:color w:val="000000"/>
+          <w:sz w:val="24"/>
+          <w:szCs w:val="24"/>
+        </w:rPr>
+      </w:pPr>
+      <w:r>
+        <w:rPr>
+          <w:rFonts w:ascii="Arial" w:hAnsi="Arial" w:cs="Arial"/>
+          <w:b/>
+          <w:bCs/>
+          <w:color w:val="000000"/>
+          <w:sz w:val="24"/>
+          <w:szCs w:val="24"/>
+        </w:rPr>
+        <w:t>4 – ESTIMATIVA DAS QUANTIDADES</w:t>
+      </w:r>
+    </w:p>
+    <w:p>
+      <w:pPr>
+        <w:spacing w:line="360" w:lineRule="auto"/>
+        <w:jc w:val="both"/>
+        <w:rPr>
+          <w:rFonts w:ascii="Arial" w:hAnsi="Arial" w:cs="Arial"/>
+          <w:color w:val="000000"/>
+          <w:sz w:val="24"/>
+          <w:szCs w:val="24"/>
+        </w:rPr>
+      </w:pPr>
+      <w:r>
+        <w:rPr>
+          <w:rFonts w:ascii="Arial" w:hAnsi="Arial" w:cs="Arial"/>
+          <w:color w:val="000000"/>
+          <w:sz w:val="24"/>
+          <w:szCs w:val="24"/>
+        </w:rPr>
+        <w:t>Conforme planilha de custos e memória de cálculo em anexo</w:t>
+      </w:r>
+    </w:p>
+    <w:p>
+      <w:pPr>
+        <w:spacing w:line="360" w:lineRule="auto"/>
+        <w:jc w:val="both"/>
+        <w:rPr>
+          <w:rFonts w:ascii="Arial" w:hAnsi="Arial" w:cs="Arial"/>
+          <w:color w:val="000000"/>
+          <w:sz w:val="24"/>
+          <w:szCs w:val="24"/>
+        </w:rPr>
+      </w:pPr>
+    </w:p>
+    <w:p>
+      <w:pPr>
+        <w:spacing w:line="360" w:lineRule="auto"/>
+        <w:jc w:val="both"/>
+        <w:rPr>
+          <w:rFonts w:ascii="Arial" w:hAnsi="Arial" w:cs="Arial"/>
+          <w:b/>
+          <w:sz w:val="24"/>
+          <w:szCs w:val="24"/>
+        </w:rPr>
+      </w:pPr>
+      <w:r>
+        <w:rPr>
+          <w:rFonts w:ascii="Arial" w:hAnsi="Arial" w:cs="Arial"/>
+          <w:b/>
+          <w:sz w:val="24"/>
+          <w:szCs w:val="24"/>
+        </w:rPr>
+        <w:t>5 – LEVANTAMENTO DE MERCADO</w:t>
+      </w:r>
+    </w:p>
+    <w:p>
+      <w:pPr>
+        <w:spacing w:line="360" w:lineRule="auto"/>
+        <w:jc w:val="both"/>
+        <w:rPr>
+          <w:rFonts w:ascii="Arial" w:hAnsi="Arial" w:cs="Arial"/>
+          <w:color w:val="000000" w:themeColor="text1"/>
+          <w:sz w:val="24"/>
+          <w:szCs w:val="24"/>
+        </w:rPr>
+      </w:pPr>
+      <w:r>
+        <w:rPr>
+          <w:rFonts w:ascii="Arial" w:hAnsi="Arial" w:cs="Arial"/>
+          <w:color w:val="000000" w:themeColor="text1"/>
+          <w:sz w:val="24"/>
+          <w:szCs w:val="24"/>
+        </w:rPr>
+        <w:t>O levantamento de mercado foi realizado mediante a elaboração de Planilha Orçamentária, adotando-se como referência principal a tabela oficial estadual de custos, consubstanciada na planilha da CDHU – SP.</w:t>
+      </w:r>
+    </w:p>
+    <w:p>
+      <w:pPr>
+        <w:spacing w:line="360" w:lineRule="auto"/>
+        <w:jc w:val="both"/>
+        <w:rPr>
+          <w:rFonts w:ascii="Arial" w:hAnsi="Arial" w:cs="Arial"/>
+          <w:color w:val="000000" w:themeColor="text1"/>
+          <w:sz w:val="24"/>
+          <w:szCs w:val="24"/>
+        </w:rPr>
+      </w:pPr>
+      <w:r>
+        <w:rPr>
+          <w:rFonts w:ascii="Arial" w:hAnsi="Arial" w:cs="Arial"/>
+          <w:color w:val="000000" w:themeColor="text1"/>
+          <w:sz w:val="24"/>
+          <w:szCs w:val="24"/>
+        </w:rPr>
+        <w:t xml:space="preserve">Na hipótese de inexistência de determinado item na referida tabela, serão utilizadas as tabelas referenciais SINAPI – SP e SIURB – SP, observando-se </w:t>
+      </w:r>
+      <w:r>
+        <w:rPr>
+          <w:rFonts w:ascii="Arial" w:hAnsi="Arial" w:cs="Arial"/>
+          <w:color w:val="000000" w:themeColor="text1"/>
+          <w:sz w:val="24"/>
+          <w:szCs w:val="24"/>
+        </w:rPr>
+        <w:lastRenderedPageBreak/>
+        <w:t>sempre a compatibilidade técnica dos insumos e serviços com o objeto da contratação.</w:t>
+      </w:r>
+    </w:p>
+    <w:p>
+      <w:pPr>
+        <w:spacing w:line="360" w:lineRule="auto"/>
+        <w:jc w:val="both"/>
+        <w:rPr>
+          <w:rFonts w:ascii="Arial" w:hAnsi="Arial" w:cs="Arial"/>
+          <w:color w:val="000000" w:themeColor="text1"/>
+          <w:sz w:val="24"/>
+          <w:szCs w:val="24"/>
+        </w:rPr>
+      </w:pPr>
+    </w:p>
+    <w:p>
+      <w:pPr>
+        <w:spacing w:line="360" w:lineRule="auto"/>
+        <w:jc w:val="both"/>
+        <w:rPr>
+          <w:rFonts w:ascii="Arial" w:hAnsi="Arial" w:cs="Arial"/>
+          <w:b/>
+          <w:bCs/>
+          <w:color w:val="000000"/>
+          <w:sz w:val="24"/>
+          <w:szCs w:val="24"/>
+        </w:rPr>
+      </w:pPr>
+      <w:r>
+        <w:rPr>
+          <w:rFonts w:ascii="Arial" w:hAnsi="Arial" w:cs="Arial"/>
+          <w:b/>
+          <w:bCs/>
+          <w:color w:val="000000"/>
+          <w:sz w:val="24"/>
+          <w:szCs w:val="24"/>
+        </w:rPr>
+        <w:t xml:space="preserve">6 – ESTIMATIVA DO </w:t>
+      </w:r>
+      <w:r>
+        <w:rPr>
+          <w:rFonts w:ascii="Arial" w:hAnsi="Arial" w:cs="Arial"/>
+          <w:b/>
+          <w:bCs/>
+          <w:color w:val="000000"/>
+          <w:sz w:val="24"/>
+          <w:szCs w:val="24"/>
+        </w:rPr>
+        <w:t>VALOR DA CONTRATAÇÃO</w:t>
+      </w:r>
+    </w:p>
+    <w:p>
+      <w:pPr>
+        <w:spacing w:line="360" w:lineRule="auto"/>
+        <w:jc w:val="both"/>
+        <w:rPr>
+          <w:rFonts w:ascii="Arial" w:hAnsi="Arial" w:cs="Arial"/>
+          <w:color w:val="FF0000"/>
+          <w:sz w:val="24"/>
+          <w:szCs w:val="24"/>
+        </w:rPr>
+      </w:pPr>
+      <w:r>
+        <w:rPr>
+          <w:rFonts w:ascii="Arial" w:hAnsi="Arial" w:cs="Arial"/>
+          <w:sz w:val="24"/>
+          <w:szCs w:val="24"/>
+        </w:rPr>
+        <w:t>Conforme planilha de custos em anexo o valor estimado é de</w:t>
+      </w:r>
+      <w:r>
+        <w:rPr>
+          <w:rFonts w:ascii="Arial" w:hAnsi="Arial" w:cs="Arial"/>
+          <w:sz w:val="24"/>
+          <w:szCs w:val="24"/>
+        </w:rPr>
+        <w:t xml:space="preserve"> </w:t>
+      </w:r>
+      <w:r>
+        <w:rPr>
+          <w:rFonts w:ascii="Arial" w:hAnsi="Arial" w:cs="Arial"/>
+          <w:color w:val="FF0000"/>
+          <w:sz w:val="24"/>
+          <w:szCs w:val="24"/>
+        </w:rPr>
+        <w:t xml:space="preserve">{{etp_estimated_value}}</w:t>
+      </w:r>
+      <w:r>
+        <w:rPr>
+          <w:rFonts w:ascii="Arial" w:hAnsi="Arial" w:cs="Arial"/>
+          <w:color w:val="FF0000"/>
+          <w:sz w:val="24"/>
+          <w:szCs w:val="24"/>
+        </w:rPr>
+        <w:t/>
+      </w:r>
+      <w:r>
+        <w:rPr>
+          <w:rFonts w:ascii="Arial" w:hAnsi="Arial" w:cs="Arial"/>
+          <w:color w:val="FF0000"/>
+          <w:sz w:val="24"/>
+        </w:rPr>
+        <w:t xml:space="preserve"/>
+      </w:r>
+      <w:r>
+        <w:rPr>
+          <w:rFonts w:ascii="Arial" w:hAnsi="Arial" w:cs="Arial"/>
+          <w:color w:val="FF0000"/>
+          <w:sz w:val="24"/>
+          <w:szCs w:val="24"/>
+        </w:rPr>
+        <w:t/>
+      </w:r>
+      <w:r>
+        <w:rPr>
+          <w:rFonts w:ascii="Arial" w:hAnsi="Arial" w:cs="Arial"/>
+          <w:color w:val="FF0000"/>
+          <w:sz w:val="24"/>
+          <w:szCs w:val="24"/>
+        </w:rPr>
+        <w:t/>
+      </w:r>
+    </w:p>
+    <w:p>
+      <w:pPr>
+        <w:spacing w:line="360" w:lineRule="auto"/>
+        <w:jc w:val="both"/>
+        <w:rPr>
+          <w:rFonts w:ascii="Arial" w:hAnsi="Arial" w:cs="Arial"/>
+          <w:color w:val="EE0000"/>
+          <w:sz w:val="24"/>
+          <w:szCs w:val="24"/>
+        </w:rPr>
+      </w:pPr>
+    </w:p>
+    <w:p>
+      <w:pPr>
+        <w:spacing w:line="360" w:lineRule="auto"/>
+        <w:jc w:val="both"/>
+        <w:rPr>
+          <w:rFonts w:ascii="Arial" w:hAnsi="Arial" w:cs="Arial"/>
+          <w:b/>
+          <w:bCs/>
+          <w:sz w:val="24"/>
+          <w:szCs w:val="24"/>
+        </w:rPr>
+      </w:pPr>
+      <w:r>
+        <w:rPr>
+          <w:rFonts w:ascii="Arial" w:hAnsi="Arial" w:cs="Arial"/>
+          <w:b/>
+          <w:bCs/>
+          <w:sz w:val="24"/>
+          <w:szCs w:val="24"/>
+        </w:rPr>
+        <w:t>7 - DESCRIÇÃO DA SOLUÇÃO COMO UM TODO</w:t>
+      </w:r>
+    </w:p>
+    <w:p>
+      <w:pPr>
+        <w:spacing w:line="360" w:lineRule="auto"/>
+        <w:jc w:val="both"/>
+        <w:rPr>
+          <w:rFonts w:ascii="Arial" w:hAnsi="Arial" w:cs="Arial"/>
+          <w:color w:val="000000" w:themeColor="text1"/>
+          <w:sz w:val="24"/>
+          <w:szCs w:val="24"/>
+        </w:rPr>
+      </w:pPr>
+      <w:r>
+        <w:rPr>
+          <w:rFonts w:ascii="Arial" w:hAnsi="Arial" w:cs="Arial"/>
+          <w:color w:val="000000" w:themeColor="text1"/>
+          <w:sz w:val="24"/>
+          <w:szCs w:val="24"/>
+        </w:rPr>
+        <w:t>A presente contratação destina-se à empresa que atenda integralmente à descrição dos serviços especificados no memorial descritivo em anexo, comprometendo-se a cumprir todas as condições e exigências nele estabelecidas.</w:t>
+      </w:r>
+    </w:p>
+    <w:p>
+      <w:pPr>
+        <w:spacing w:line="360" w:lineRule="auto"/>
+        <w:jc w:val="both"/>
+        <w:rPr>
+          <w:rFonts w:ascii="Arial" w:hAnsi="Arial" w:cs="Arial"/>
+          <w:color w:val="000000" w:themeColor="text1"/>
+          <w:sz w:val="24"/>
+          <w:szCs w:val="24"/>
+        </w:rPr>
+      </w:pPr>
+    </w:p>
+    <w:p>
+      <w:pPr>
+        <w:spacing w:line="360" w:lineRule="auto"/>
+        <w:jc w:val="both"/>
+        <w:rPr>
+          <w:rFonts w:ascii="Arial" w:hAnsi="Arial" w:cs="Arial"/>
+          <w:b/>
+          <w:bCs/>
+          <w:color w:val="000000"/>
+          <w:sz w:val="24"/>
+          <w:szCs w:val="24"/>
+        </w:rPr>
+      </w:pPr>
+      <w:r>
+        <w:rPr>
+          <w:rFonts w:ascii="Arial" w:hAnsi="Arial" w:cs="Arial"/>
+          <w:b/>
+          <w:bCs/>
+          <w:color w:val="000000"/>
+          <w:sz w:val="24"/>
+          <w:szCs w:val="24"/>
+        </w:rPr>
+        <w:t>8 – JUSTIFICATIVA PARA PARCELAMENTO</w:t>
+      </w:r>
+      <w:r>
+        <w:rPr>
+          <w:rFonts w:ascii="Arial" w:hAnsi="Arial" w:cs="Arial"/>
+          <w:b/>
+          <w:bCs/>
+          <w:color w:val="000000"/>
+          <w:sz w:val="24"/>
+          <w:szCs w:val="24"/>
+        </w:rPr>
+        <w:t xml:space="preserve"> OU NÃO DA SOLUÇÃO</w:t>
+      </w:r>
+    </w:p>
+    <w:p>
+      <w:pPr>
+        <w:spacing w:line="360" w:lineRule="auto"/>
+        <w:jc w:val="both"/>
+        <w:rPr>
+          <w:rFonts w:ascii="Arial" w:hAnsi="Arial" w:cs="Arial"/>
+          <w:color w:val="000000" w:themeColor="text1"/>
+          <w:sz w:val="24"/>
+          <w:szCs w:val="24"/>
+        </w:rPr>
+      </w:pPr>
+      <w:r>
+        <w:rPr>
+          <w:rFonts w:ascii="Arial" w:hAnsi="Arial" w:cs="Arial"/>
+          <w:color w:val="000000" w:themeColor="text1"/>
+          <w:sz w:val="24"/>
+          <w:szCs w:val="24"/>
+        </w:rPr>
+        <w:t>A empresa deverá executar todas as atividades previstas, respeitando rigorosamente os prazos estabelecidos no cronograma físico-financeiro que acompanha este documento.</w:t>
+      </w:r>
+    </w:p>
+    <w:p>
+      <w:pPr>
+        <w:spacing w:line="360" w:lineRule="auto"/>
+        <w:jc w:val="both"/>
+        <w:rPr>
+          <w:rFonts w:ascii="Arial" w:hAnsi="Arial" w:cs="Arial"/>
+          <w:b/>
+          <w:sz w:val="24"/>
+          <w:szCs w:val="24"/>
+        </w:rPr>
+      </w:pPr>
+    </w:p>
+    <w:p>
+      <w:pPr>
+        <w:spacing w:line="360" w:lineRule="auto"/>
+        <w:jc w:val="both"/>
+        <w:rPr>
+          <w:rFonts w:ascii="Arial" w:hAnsi="Arial" w:cs="Arial"/>
+          <w:b/>
+          <w:sz w:val="24"/>
+          <w:szCs w:val="24"/>
+        </w:rPr>
+      </w:pPr>
+      <w:r>
+        <w:rPr>
+          <w:rFonts w:ascii="Arial" w:hAnsi="Arial" w:cs="Arial"/>
+          <w:b/>
+          <w:sz w:val="24"/>
+          <w:szCs w:val="24"/>
+        </w:rPr>
+        <w:t>9 - DEMONSTRATIVO DOS RESULTADOS PRETENDIDOS</w:t>
+      </w:r>
+    </w:p>
+    <w:p>
+      <w:pPr>
+        <w:spacing w:line="360" w:lineRule="auto"/>
+        <w:jc w:val="both"/>
+        <w:rPr>
+          <w:rFonts w:ascii="Arial" w:hAnsi="Arial" w:cs="Arial"/>
+          <w:color w:val="000000" w:themeColor="text1"/>
+          <w:sz w:val="24"/>
+          <w:szCs w:val="24"/>
+        </w:rPr>
+      </w:pPr>
+      <w:r>
+        <w:rPr>
+          <w:rFonts w:ascii="Arial" w:hAnsi="Arial" w:cs="Arial"/>
+          <w:color w:val="000000" w:themeColor="text1"/>
+          <w:sz w:val="24"/>
+          <w:szCs w:val="24"/>
+        </w:rPr>
+        <w:t xml:space="preserve">Com </w:t>
+      </w:r>
+      <w:r>
+        <w:rPr>
+          <w:rFonts w:ascii="Arial" w:hAnsi="Arial" w:cs="Arial"/>
+          <w:color w:val="000000" w:themeColor="text1"/>
+          <w:sz w:val="24"/>
+          <w:szCs w:val="24"/>
+        </w:rPr>
+        <w:t>a adequação do equipamento</w:t>
+      </w:r>
+      <w:r>
+        <w:rPr>
+          <w:rFonts w:ascii="Arial" w:hAnsi="Arial" w:cs="Arial"/>
+          <w:color w:val="000000" w:themeColor="text1"/>
+          <w:sz w:val="24"/>
+          <w:szCs w:val="24"/>
+        </w:rPr>
+        <w:t xml:space="preserve"> serão oferecidos aos munícipes:</w:t>
+      </w:r>
+    </w:p>
+    <w:p>
+      <w:pPr>
+        <w:spacing w:line="360" w:lineRule="auto"/>
+        <w:jc w:val="both"/>
+        <w:rPr>
+          <w:rFonts w:ascii="Arial" w:hAnsi="Arial" w:cs="Arial"/>
+          <w:b/>
+          <w:color w:val="000000" w:themeColor="text1"/>
+          <w:sz w:val="24"/>
+          <w:szCs w:val="24"/>
+        </w:rPr>
+      </w:pPr>
+    </w:p>
+    <w:p>
+      <w:pPr>
+        <w:spacing w:line="360" w:lineRule="auto"/>
+        <w:jc w:val="both"/>
+        <w:rPr>
+          <w:rFonts w:ascii="Arial" w:hAnsi="Arial" w:cs="Arial"/>
+          <w:color w:val="000000" w:themeColor="text1"/>
+          <w:sz w:val="24"/>
+          <w:szCs w:val="24"/>
+        </w:rPr>
+      </w:pPr>
+      <w:r>
+        <w:rPr>
+          <w:rFonts w:ascii="Arial" w:hAnsi="Arial" w:cs="Arial"/>
+          <w:b/>
+          <w:color w:val="000000" w:themeColor="text1"/>
+          <w:sz w:val="24"/>
+          <w:szCs w:val="24"/>
+        </w:rPr>
+        <w:t>Apreciação</w:t>
+      </w:r>
+      <w:r>
+        <w:rPr>
+          <w:rFonts w:ascii="Arial" w:hAnsi="Arial" w:cs="Arial"/>
+          <w:b/>
+          <w:color w:val="000000" w:themeColor="text1"/>
+          <w:sz w:val="24"/>
+          <w:szCs w:val="24"/>
+        </w:rPr>
+        <w:t xml:space="preserve"> social</w:t>
+      </w:r>
+      <w:r>
+        <w:rPr>
+          <w:rFonts w:ascii="Arial" w:hAnsi="Arial" w:cs="Arial"/>
+          <w:b/>
+          <w:color w:val="000000" w:themeColor="text1"/>
+          <w:sz w:val="24"/>
+          <w:szCs w:val="24"/>
+        </w:rPr>
+        <w:t>:</w:t>
+      </w:r>
+      <w:r>
+        <w:rPr>
+          <w:rFonts w:ascii="Arial" w:hAnsi="Arial" w:cs="Arial"/>
+          <w:color w:val="000000" w:themeColor="text1"/>
+          <w:sz w:val="24"/>
+          <w:szCs w:val="24"/>
+        </w:rPr>
+        <w:t xml:space="preserve"> </w:t>
+      </w:r>
+      <w:r>
+        <w:rPr>
+          <w:rFonts w:ascii="Arial" w:hAnsi="Arial" w:cs="Arial"/>
+          <w:color w:val="000000" w:themeColor="text1"/>
+          <w:sz w:val="24"/>
+          <w:szCs w:val="24"/>
+        </w:rPr>
+        <w:t>O plano de reforma tem por objetivo restabelecer as condições adequ</w:t>
+      </w:r>
+      <w:r>
+        <w:rPr>
+          <w:rFonts w:ascii="Arial" w:hAnsi="Arial" w:cs="Arial"/>
+          <w:color w:val="000000" w:themeColor="text1"/>
+          <w:sz w:val="24"/>
+          <w:szCs w:val="24"/>
+        </w:rPr>
+        <w:t xml:space="preserve">adas de conservação e segurança </w:t>
+      </w:r>
+      <w:r>
+        <w:rPr>
+          <w:rFonts w:ascii="Arial" w:hAnsi="Arial" w:cs="Arial"/>
+          <w:color w:val="000000" w:themeColor="text1"/>
+          <w:sz w:val="24"/>
+          <w:szCs w:val="24"/>
+        </w:rPr>
+        <w:t xml:space="preserve">do </w:t>
+      </w:r>
+      <w:r>
+        <w:rPr>
+          <w:rFonts w:ascii="Arial" w:hAnsi="Arial" w:cs="Arial"/>
+          <w:color w:val="FF0000"/>
+          <w:sz w:val="24"/>
+          <w:szCs w:val="24"/>
+        </w:rPr>
+        <w:t>{{etp_social_object}}</w:t>
+      </w:r>
+      <w:r>
+        <w:rPr>
+          <w:rFonts w:ascii="Arial" w:hAnsi="Arial" w:cs="Arial"/>
+          <w:color w:val="000000" w:themeColor="text1"/>
+          <w:sz w:val="24"/>
+          <w:szCs w:val="24"/>
+        </w:rPr>
+        <w:t>. Ademais, a execução da intervenção contribui para prevenir a depreciação do bem público, assegurando sua conservação, funcionalidade e valorização, em observância aos princípios da eficiência administrativa e da boa gestão patrimonial.</w:t>
+      </w:r>
+    </w:p>
+    <w:p>
+      <w:pPr>
+        <w:spacing w:line="360" w:lineRule="auto"/>
+        <w:jc w:val="both"/>
+        <w:rPr>
+          <w:rFonts w:ascii="Arial" w:hAnsi="Arial" w:cs="Arial"/>
+          <w:color w:val="000000" w:themeColor="text1"/>
+          <w:sz w:val="24"/>
+          <w:szCs w:val="24"/>
+        </w:rPr>
+      </w:pPr>
+      <w:r>
+        <w:rPr>
+          <w:rFonts w:ascii="Arial" w:hAnsi="Arial" w:cs="Arial"/>
+          <w:b/>
+          <w:color w:val="000000" w:themeColor="text1"/>
+          <w:sz w:val="24"/>
+          <w:szCs w:val="24"/>
+        </w:rPr>
+        <w:t>Qualificação operacional</w:t>
+      </w:r>
+      <w:r>
+        <w:rPr>
+          <w:rFonts w:ascii="Arial" w:hAnsi="Arial" w:cs="Arial"/>
+          <w:b/>
+          <w:color w:val="000000" w:themeColor="text1"/>
+          <w:sz w:val="24"/>
+          <w:szCs w:val="24"/>
+        </w:rPr>
+        <w:t>:</w:t>
+      </w:r>
+      <w:r>
+        <w:rPr>
+          <w:rFonts w:ascii="Arial" w:hAnsi="Arial" w:cs="Arial"/>
+          <w:color w:val="000000" w:themeColor="text1"/>
+          <w:sz w:val="24"/>
+          <w:szCs w:val="24"/>
+        </w:rPr>
+        <w:t xml:space="preserve"> </w:t>
+      </w:r>
+      <w:r>
+        <w:rPr>
+          <w:rFonts w:ascii="Arial" w:hAnsi="Arial" w:cs="Arial"/>
+          <w:color w:val="000000" w:themeColor="text1"/>
+          <w:sz w:val="24"/>
+          <w:szCs w:val="24"/>
+        </w:rPr>
+        <w:t xml:space="preserve">A reforma do </w:t>
+      </w:r>
+      <w:r>
+        <w:rPr>
+          <w:rFonts w:ascii="Arial" w:hAnsi="Arial" w:cs="Arial"/>
+          <w:color w:val="FF0000"/>
+          <w:sz w:val="24"/>
+          <w:szCs w:val="24"/>
+        </w:rPr>
+        <w:t>{{etp_operational_object}}</w:t>
+      </w:r>
+      <w:r>
+        <w:rPr>
+          <w:rFonts w:ascii="Arial" w:hAnsi="Arial" w:cs="Arial"/>
+          <w:color w:val="000000" w:themeColor="text1"/>
+          <w:sz w:val="24"/>
+          <w:szCs w:val="24"/>
+        </w:rPr>
+        <w:t xml:space="preserve"> </w:t>
+      </w:r>
+      <w:r>
+        <w:rPr>
+          <w:rFonts w:ascii="Arial" w:hAnsi="Arial" w:cs="Arial"/>
+          <w:color w:val="000000" w:themeColor="text1"/>
+          <w:sz w:val="24"/>
+          <w:szCs w:val="24"/>
+        </w:rPr>
+        <w:t>proporcionará melhores condições estruturais, visuais e funcionais do equipamento público, assegurando maior durabilidade, segurança e adequada apresentação urbana, em conformidade com a legislação e as normas técnicas vigentes.</w:t>
+      </w:r>
+    </w:p>
+    <w:p>
+      <w:pPr>
+        <w:spacing w:line="360" w:lineRule="auto"/>
+        <w:jc w:val="both"/>
+        <w:rPr>
+          <w:rFonts w:ascii="Arial" w:hAnsi="Arial" w:cs="Arial"/>
+          <w:color w:val="FF0000"/>
+          <w:sz w:val="24"/>
+          <w:szCs w:val="24"/>
+        </w:rPr>
+      </w:pPr>
+    </w:p>
+    <w:p>
+      <w:pPr>
+        <w:shd w:val="clear" w:color="auto" w:fill="FFFFFF"/>
+        <w:spacing w:line="360" w:lineRule="auto"/>
+        <w:jc w:val="both"/>
+        <w:textAlignment w:val="baseline"/>
+        <w:rPr>
+          <w:rFonts w:ascii="Arial" w:hAnsi="Arial" w:cs="Arial"/>
+          <w:b/>
+          <w:bCs/>
+          <w:color w:val="000000"/>
+          <w:sz w:val="24"/>
+          <w:szCs w:val="24"/>
+        </w:rPr>
+      </w:pPr>
+      <w:r>
+        <w:rPr>
+          <w:rFonts w:ascii="Arial" w:hAnsi="Arial" w:cs="Arial"/>
+          <w:b/>
+          <w:bCs/>
+          <w:color w:val="000000"/>
+          <w:sz w:val="24"/>
+          <w:szCs w:val="24"/>
+        </w:rPr>
+        <w:t>10 – PROVIDÊNCIAS PRÉVIAS AO CONTRATO</w:t>
+      </w:r>
+    </w:p>
+    <w:p>
+      <w:pPr>
+        <w:shd w:val="clear" w:color="auto" w:fill="FFFFFF"/>
+        <w:spacing w:line="360" w:lineRule="auto"/>
+        <w:jc w:val="both"/>
+        <w:textAlignment w:val="baseline"/>
+        <w:rPr>
+          <w:rFonts w:ascii="Arial" w:hAnsi="Arial" w:cs="Arial"/>
+          <w:color w:val="000000"/>
+          <w:sz w:val="24"/>
+          <w:szCs w:val="24"/>
+        </w:rPr>
+      </w:pPr>
+      <w:r>
+        <w:rPr>
+          <w:rFonts w:ascii="Arial" w:hAnsi="Arial" w:cs="Arial"/>
+          <w:color w:val="000000"/>
+          <w:sz w:val="24"/>
+          <w:szCs w:val="24"/>
+        </w:rPr>
+        <w:t>Não se aplica</w:t>
+      </w:r>
+    </w:p>
+    <w:p>
+      <w:pPr>
+        <w:shd w:val="clear" w:color="auto" w:fill="FFFFFF"/>
+        <w:spacing w:line="360" w:lineRule="auto"/>
+        <w:jc w:val="both"/>
+        <w:textAlignment w:val="baseline"/>
+        <w:rPr>
+          <w:rFonts w:ascii="Arial" w:hAnsi="Arial" w:cs="Arial"/>
+          <w:bCs/>
+          <w:color w:val="000000"/>
+          <w:sz w:val="24"/>
+          <w:szCs w:val="24"/>
+        </w:rPr>
+      </w:pPr>
+    </w:p>
+    <w:p>
+      <w:pPr>
+        <w:shd w:val="clear" w:color="auto" w:fill="FFFFFF"/>
+        <w:spacing w:line="360" w:lineRule="auto"/>
+        <w:jc w:val="both"/>
+        <w:textAlignment w:val="baseline"/>
+        <w:rPr>
+          <w:rFonts w:ascii="Arial" w:hAnsi="Arial" w:cs="Arial"/>
+          <w:b/>
+          <w:bCs/>
+          <w:color w:val="000000"/>
+          <w:sz w:val="24"/>
+          <w:szCs w:val="24"/>
+        </w:rPr>
+      </w:pPr>
+      <w:r>
+        <w:rPr>
+          <w:rFonts w:ascii="Arial" w:hAnsi="Arial" w:cs="Arial"/>
+          <w:b/>
+          <w:bCs/>
+          <w:color w:val="000000"/>
+          <w:sz w:val="24"/>
+          <w:szCs w:val="24"/>
+        </w:rPr>
+        <w:t>11 – CONTRATAÇÕES CORRELATAS/INTERDEPENDENTES</w:t>
+      </w:r>
+    </w:p>
+    <w:p>
+      <w:pPr>
+        <w:shd w:val="clear" w:color="auto" w:fill="FFFFFF"/>
+        <w:spacing w:line="360" w:lineRule="auto"/>
+        <w:jc w:val="both"/>
+        <w:textAlignment w:val="baseline"/>
+        <w:rPr>
+          <w:rFonts w:ascii="Arial" w:hAnsi="Arial" w:cs="Arial"/>
+          <w:bCs/>
+          <w:color w:val="000000"/>
+          <w:sz w:val="24"/>
+          <w:szCs w:val="24"/>
+        </w:rPr>
+      </w:pPr>
+      <w:r>
+        <w:rPr>
+          <w:rFonts w:ascii="Arial" w:hAnsi="Arial" w:cs="Arial"/>
+          <w:color w:val="000000"/>
+          <w:sz w:val="24"/>
+          <w:szCs w:val="24"/>
+        </w:rPr>
+        <w:t>Não se aplica</w:t>
+      </w:r>
+    </w:p>
+    <w:p>
+      <w:pPr>
+        <w:shd w:val="clear" w:color="auto" w:fill="FFFFFF"/>
+        <w:spacing w:line="360" w:lineRule="auto"/>
+        <w:jc w:val="both"/>
+        <w:textAlignment w:val="baseline"/>
+        <w:rPr>
+          <w:rFonts w:ascii="Arial" w:hAnsi="Arial" w:cs="Arial"/>
+          <w:bCs/>
+          <w:color w:val="000000"/>
+          <w:sz w:val="24"/>
+          <w:szCs w:val="24"/>
+        </w:rPr>
+      </w:pPr>
+    </w:p>
+    <w:p>
+      <w:pPr>
+        <w:shd w:val="clear" w:color="auto" w:fill="FFFFFF"/>
+        <w:spacing w:line="360" w:lineRule="auto"/>
+        <w:jc w:val="both"/>
+        <w:textAlignment w:val="baseline"/>
+        <w:rPr>
+          <w:rFonts w:ascii="Arial" w:hAnsi="Arial" w:cs="Arial"/>
+          <w:b/>
+          <w:bCs/>
+          <w:color w:val="000000"/>
+          <w:sz w:val="24"/>
+          <w:szCs w:val="24"/>
+        </w:rPr>
+      </w:pPr>
+      <w:r>
+        <w:rPr>
+          <w:rFonts w:ascii="Arial" w:hAnsi="Arial" w:cs="Arial"/>
+          <w:b/>
+          <w:bCs/>
+          <w:color w:val="000000"/>
+          <w:sz w:val="24"/>
+          <w:szCs w:val="24"/>
+        </w:rPr>
+        <w:t>12 – IMPACTOS AMBIENTAIS</w:t>
+      </w:r>
+    </w:p>
+    <w:p>
+      <w:pPr>
+        <w:spacing w:line="360" w:lineRule="auto"/>
+        <w:jc w:val="both"/>
+        <w:rPr>
+          <w:rFonts w:ascii="Arial" w:hAnsi="Arial" w:cs="Arial"/>
+          <w:sz w:val="24"/>
+          <w:szCs w:val="24"/>
+        </w:rPr>
+      </w:pPr>
+      <w:r>
+        <w:rPr>
+          <w:rFonts w:ascii="Arial" w:hAnsi="Arial" w:cs="Arial"/>
+          <w:sz w:val="24"/>
+          <w:szCs w:val="24"/>
+        </w:rPr>
+        <w:t>A execução de prestação de serviços pode gerar impactos ambientais, principalmente relacionados à geração de resíduos sólidos e ao uso de materiais durante as atividades em obra. A solução técnica proposta contempla medidas que visam minimizar esses impactos, promovendo a sustentabilidade e a responsabilidade ambiental.</w:t>
+      </w:r>
+    </w:p>
+    <w:p>
+      <w:pPr>
+        <w:spacing w:line="360" w:lineRule="auto"/>
+        <w:jc w:val="both"/>
+        <w:rPr>
+          <w:rFonts w:ascii="Arial" w:hAnsi="Arial" w:cs="Arial"/>
+          <w:sz w:val="24"/>
+          <w:szCs w:val="24"/>
+        </w:rPr>
+      </w:pPr>
+      <w:r>
+        <w:rPr>
+          <w:rFonts w:ascii="Arial" w:hAnsi="Arial" w:cs="Arial"/>
+          <w:sz w:val="24"/>
+          <w:szCs w:val="24"/>
+        </w:rPr>
+        <w:t>O</w:t>
+      </w:r>
+      <w:r>
+        <w:rPr>
+          <w:rFonts w:ascii="Arial" w:hAnsi="Arial" w:cs="Arial"/>
+          <w:sz w:val="24"/>
+          <w:szCs w:val="24"/>
+        </w:rPr>
+        <w:t>s principais impactos ambientais negativos identificados:</w:t>
+      </w:r>
+      <w:r>
+        <w:rPr>
+          <w:rFonts w:ascii="Arial" w:hAnsi="Arial" w:cs="Arial"/>
+          <w:sz w:val="24"/>
+          <w:szCs w:val="24"/>
+        </w:rPr>
+        <w:t xml:space="preserve"> </w:t>
+      </w:r>
+      <w:r>
+        <w:rPr>
+          <w:rFonts w:ascii="Arial" w:hAnsi="Arial" w:cs="Arial"/>
+          <w:sz w:val="24"/>
+          <w:szCs w:val="24"/>
+        </w:rPr>
+        <w:t>resíduos de construção e demolição</w:t>
+      </w:r>
+      <w:r>
+        <w:rPr>
+          <w:rFonts w:ascii="Arial" w:hAnsi="Arial" w:cs="Arial"/>
+          <w:sz w:val="24"/>
+          <w:szCs w:val="24"/>
+        </w:rPr>
+        <w:t xml:space="preserve"> (Telha, m</w:t>
+      </w:r>
+      <w:r>
+        <w:rPr>
+          <w:rFonts w:ascii="Arial" w:hAnsi="Arial" w:cs="Arial"/>
+          <w:sz w:val="24"/>
+          <w:szCs w:val="24"/>
+        </w:rPr>
+        <w:t>adeira, EPS, cerâmica e cimento)</w:t>
+      </w:r>
+      <w:r>
+        <w:rPr>
+          <w:rFonts w:ascii="Arial" w:hAnsi="Arial" w:cs="Arial"/>
+          <w:sz w:val="24"/>
+          <w:szCs w:val="24"/>
+        </w:rPr>
+        <w:t xml:space="preserve">, </w:t>
+      </w:r>
+      <w:r>
+        <w:rPr>
+          <w:rFonts w:ascii="Arial" w:hAnsi="Arial" w:cs="Arial"/>
+          <w:sz w:val="24"/>
+          <w:szCs w:val="24"/>
+        </w:rPr>
+        <w:t>resíduos químicos</w:t>
+      </w:r>
+      <w:r>
+        <w:rPr>
+          <w:rFonts w:ascii="Arial" w:hAnsi="Arial" w:cs="Arial"/>
+          <w:sz w:val="24"/>
+          <w:szCs w:val="24"/>
+        </w:rPr>
+        <w:t xml:space="preserve"> (Tintas, </w:t>
+      </w:r>
+      <w:r>
+        <w:rPr>
+          <w:rFonts w:ascii="Arial" w:hAnsi="Arial" w:cs="Arial"/>
+          <w:sz w:val="24"/>
+          <w:szCs w:val="24"/>
+        </w:rPr>
+        <w:t>impermeabilizantes e solventes).</w:t>
+      </w:r>
+    </w:p>
+    <w:p>
+      <w:pPr>
+        <w:spacing w:line="360" w:lineRule="auto"/>
+        <w:jc w:val="both"/>
+        <w:rPr>
+          <w:rFonts w:ascii="Arial" w:hAnsi="Arial" w:cs="Arial"/>
+          <w:sz w:val="24"/>
+          <w:szCs w:val="24"/>
+        </w:rPr>
+      </w:pPr>
+      <w:r>
+        <w:rPr>
+          <w:rFonts w:ascii="Arial" w:hAnsi="Arial" w:cs="Arial"/>
+          <w:sz w:val="24"/>
+          <w:szCs w:val="24"/>
+        </w:rPr>
+        <w:t>Para mitigar esses impactos, a Contratada será obrigada a:</w:t>
+      </w:r>
+    </w:p>
+    <w:p>
+      <w:pPr>
+        <w:spacing w:line="360" w:lineRule="auto"/>
+        <w:jc w:val="both"/>
+        <w:rPr>
+          <w:rFonts w:ascii="Arial" w:hAnsi="Arial" w:cs="Arial"/>
+          <w:sz w:val="24"/>
+          <w:szCs w:val="24"/>
+        </w:rPr>
+      </w:pPr>
+      <w:r>
+        <w:rPr>
+          <w:rFonts w:ascii="Arial" w:hAnsi="Arial" w:cs="Arial"/>
+          <w:b/>
+          <w:sz w:val="24"/>
+          <w:szCs w:val="24"/>
+        </w:rPr>
+        <w:t>Gerenciamento de r</w:t>
+      </w:r>
+      <w:r>
+        <w:rPr>
+          <w:rFonts w:ascii="Arial" w:hAnsi="Arial" w:cs="Arial"/>
+          <w:b/>
+          <w:sz w:val="24"/>
+          <w:szCs w:val="24"/>
+        </w:rPr>
+        <w:t>esíduos:</w:t>
+      </w:r>
+      <w:r>
+        <w:rPr>
+          <w:rFonts w:ascii="Arial" w:hAnsi="Arial" w:cs="Arial"/>
+          <w:sz w:val="24"/>
+          <w:szCs w:val="24"/>
+        </w:rPr>
+        <w:t xml:space="preserve"> Realizar o descarte adequado de todos os resíduos gerados durante a prestação dos serviços, respeitando a legislação ambiental vigente e priorizando a destinação correta, como reciclagem e descarte em locais autorizados.</w:t>
+      </w:r>
+    </w:p>
+    <w:p>
+      <w:pPr>
+        <w:spacing w:line="360" w:lineRule="auto"/>
+        <w:jc w:val="both"/>
+        <w:rPr>
+          <w:rFonts w:ascii="Arial" w:hAnsi="Arial" w:cs="Arial"/>
+          <w:sz w:val="24"/>
+          <w:szCs w:val="24"/>
+        </w:rPr>
+      </w:pPr>
+      <w:r>
+        <w:rPr>
+          <w:rFonts w:ascii="Arial" w:hAnsi="Arial" w:cs="Arial"/>
+          <w:b/>
+          <w:sz w:val="24"/>
+          <w:szCs w:val="24"/>
+        </w:rPr>
+        <w:t>Uso consciente de m</w:t>
+      </w:r>
+      <w:r>
+        <w:rPr>
+          <w:rFonts w:ascii="Arial" w:hAnsi="Arial" w:cs="Arial"/>
+          <w:b/>
+          <w:sz w:val="24"/>
+          <w:szCs w:val="24"/>
+        </w:rPr>
+        <w:t>ateriais:</w:t>
+      </w:r>
+      <w:r>
+        <w:rPr>
+          <w:rFonts w:ascii="Arial" w:hAnsi="Arial" w:cs="Arial"/>
+          <w:sz w:val="24"/>
+          <w:szCs w:val="24"/>
+        </w:rPr>
+        <w:t xml:space="preserve"> Priorizar o emprego de materiais certificados e de alta durabilidade, buscando reduzir a frequência de substituição e, consequentemente, o volume de resíduos gerados.</w:t>
+      </w:r>
+    </w:p>
+    <w:p>
+      <w:pPr>
+        <w:spacing w:line="360" w:lineRule="auto"/>
+        <w:jc w:val="both"/>
+        <w:rPr>
+          <w:rFonts w:ascii="Arial" w:hAnsi="Arial" w:cs="Arial"/>
+          <w:sz w:val="24"/>
+          <w:szCs w:val="24"/>
+        </w:rPr>
+      </w:pPr>
+    </w:p>
+    <w:p>
+      <w:pPr>
+        <w:shd w:val="clear" w:color="auto" w:fill="FFFFFF"/>
+        <w:spacing w:line="360" w:lineRule="auto"/>
+        <w:jc w:val="both"/>
+        <w:textAlignment w:val="baseline"/>
+        <w:rPr>
+          <w:rFonts w:ascii="Arial" w:hAnsi="Arial" w:cs="Arial"/>
+          <w:b/>
+          <w:bCs/>
+          <w:color w:val="000000"/>
+          <w:sz w:val="24"/>
+          <w:szCs w:val="24"/>
+        </w:rPr>
+      </w:pPr>
+      <w:r>
+        <w:rPr>
+          <w:rFonts w:ascii="Arial" w:hAnsi="Arial" w:cs="Arial"/>
+          <w:b/>
+          <w:bCs/>
+          <w:color w:val="000000"/>
+          <w:sz w:val="24"/>
+          <w:szCs w:val="24"/>
+        </w:rPr>
+        <w:t>1</w:t>
+      </w:r>
+      <w:r>
+        <w:rPr>
+          <w:rFonts w:ascii="Arial" w:hAnsi="Arial" w:cs="Arial"/>
+          <w:b/>
+          <w:bCs/>
+          <w:color w:val="000000"/>
+          <w:sz w:val="24"/>
+          <w:szCs w:val="24"/>
+        </w:rPr>
+        <w:t>3</w:t>
+      </w:r>
+      <w:r>
+        <w:rPr>
+          <w:rFonts w:ascii="Arial" w:hAnsi="Arial" w:cs="Arial"/>
+          <w:b/>
+          <w:bCs/>
+          <w:color w:val="000000"/>
+          <w:sz w:val="24"/>
+          <w:szCs w:val="24"/>
+        </w:rPr>
+        <w:t xml:space="preserve"> – </w:t>
+      </w:r>
+      <w:r>
+        <w:rPr>
+          <w:rFonts w:ascii="Arial" w:hAnsi="Arial" w:cs="Arial"/>
+          <w:b/>
+          <w:bCs/>
+          <w:color w:val="000000"/>
+          <w:sz w:val="24"/>
+          <w:szCs w:val="24"/>
+        </w:rPr>
+        <w:t>LICENÇA/AUTORIZAÇÃO/MANISFESTAÇÃO DE ORGÃOS DO GOVERNO.</w:t>
+      </w:r>
+    </w:p>
+    <w:p>
+      <w:pPr>
+        <w:pStyle w:val="Default"/>
+        <w:spacing w:line="360" w:lineRule="auto"/>
+        <w:jc w:val="both"/>
+        <w:rPr>
+          <w:rFonts w:ascii="Arial" w:hAnsi="Arial" w:cs="Arial"/>
+        </w:rPr>
+      </w:pPr>
+      <w:r>
+        <w:rPr>
+          <w:rFonts w:ascii="Arial" w:hAnsi="Arial" w:cs="Arial"/>
+        </w:rPr>
+        <w:t>Não se aplica.</w:t>
+      </w:r>
+    </w:p>
+    <w:p>
+      <w:pPr>
+        <w:pStyle w:val="Default"/>
+        <w:spacing w:line="360" w:lineRule="auto"/>
+        <w:jc w:val="both"/>
+        <w:rPr>
+          <w:rFonts w:ascii="Arial" w:hAnsi="Arial" w:cs="Arial"/>
+        </w:rPr>
+      </w:pPr>
+    </w:p>
+    <w:p>
+      <w:pPr>
+        <w:pStyle w:val="Default"/>
+        <w:spacing w:line="360" w:lineRule="auto"/>
+        <w:jc w:val="both"/>
+        <w:rPr>
+          <w:rFonts w:ascii="Arial" w:hAnsi="Arial" w:cs="Arial"/>
+        </w:rPr>
+      </w:pPr>
+    </w:p>
+    <w:p>
+      <w:pPr>
+        <w:shd w:val="clear" w:color="auto" w:fill="FFFFFF"/>
+        <w:spacing w:line="360" w:lineRule="auto"/>
+        <w:jc w:val="both"/>
+        <w:textAlignment w:val="baseline"/>
+        <w:rPr>
+          <w:rFonts w:ascii="Arial" w:hAnsi="Arial" w:cs="Arial"/>
+          <w:b/>
+          <w:bCs/>
+          <w:color w:val="000000"/>
+          <w:sz w:val="24"/>
+          <w:szCs w:val="24"/>
+        </w:rPr>
+      </w:pPr>
+      <w:r>
+        <w:rPr>
+          <w:rFonts w:ascii="Arial" w:hAnsi="Arial" w:cs="Arial"/>
+          <w:b/>
+          <w:bCs/>
+          <w:color w:val="000000"/>
+          <w:sz w:val="24"/>
+          <w:szCs w:val="24"/>
+        </w:rPr>
+        <w:t>1</w:t>
+      </w:r>
+      <w:r>
+        <w:rPr>
+          <w:rFonts w:ascii="Arial" w:hAnsi="Arial" w:cs="Arial"/>
+          <w:b/>
+          <w:bCs/>
+          <w:color w:val="000000"/>
+          <w:sz w:val="24"/>
+          <w:szCs w:val="24"/>
+        </w:rPr>
+        <w:t>4</w:t>
+      </w:r>
+      <w:r>
+        <w:rPr>
+          <w:rFonts w:ascii="Arial" w:hAnsi="Arial" w:cs="Arial"/>
+          <w:b/>
+          <w:bCs/>
+          <w:color w:val="000000"/>
+          <w:sz w:val="24"/>
+          <w:szCs w:val="24"/>
+        </w:rPr>
+        <w:t xml:space="preserve"> –</w:t>
+      </w:r>
+      <w:r>
+        <w:rPr>
+          <w:rFonts w:ascii="Arial" w:hAnsi="Arial" w:cs="Arial"/>
+          <w:b/>
+          <w:bCs/>
+          <w:color w:val="000000"/>
+          <w:sz w:val="24"/>
+          <w:szCs w:val="24"/>
+        </w:rPr>
+        <w:t xml:space="preserve"> GERENCIAMENTO DE RISCOS </w:t>
+      </w:r>
+    </w:p>
+    <w:p>
+      <w:pPr>
+        <w:shd w:val="clear" w:color="auto" w:fill="FFFFFF"/>
+        <w:spacing w:line="360" w:lineRule="auto"/>
+        <w:jc w:val="both"/>
+        <w:textAlignment w:val="baseline"/>
+        <w:rPr>
+          <w:rFonts w:ascii="Arial" w:hAnsi="Arial" w:cs="Arial"/>
+          <w:bCs/>
+          <w:color w:val="000000"/>
+          <w:sz w:val="24"/>
+          <w:szCs w:val="24"/>
+        </w:rPr>
+      </w:pPr>
+      <w:r>
+        <w:rPr>
+          <w:rFonts w:ascii="Arial" w:hAnsi="Arial" w:cs="Arial"/>
+          <w:bCs/>
+          <w:color w:val="000000"/>
+          <w:sz w:val="24"/>
+          <w:szCs w:val="24"/>
+        </w:rPr>
+        <w:t>Riscos do processo de contratação</w:t>
+      </w:r>
+      <w:r>
+        <w:rPr>
+          <w:rFonts w:ascii="Arial" w:hAnsi="Arial" w:cs="Arial"/>
+          <w:bCs/>
+          <w:color w:val="000000"/>
+          <w:sz w:val="24"/>
+          <w:szCs w:val="24"/>
+        </w:rPr>
+        <w:t xml:space="preserve"> em </w:t>
+      </w:r>
+      <w:r>
+        <w:rPr>
+          <w:rFonts w:ascii="Arial" w:hAnsi="Arial" w:cs="Arial"/>
+          <w:bCs/>
+          <w:color w:val="000000"/>
+          <w:sz w:val="24"/>
+          <w:szCs w:val="24"/>
+        </w:rPr>
+        <w:t xml:space="preserve">tabela a seguir </w:t>
+      </w:r>
+      <w:r>
+        <w:rPr>
+          <w:rFonts w:ascii="Arial" w:hAnsi="Arial" w:cs="Arial"/>
+          <w:bCs/>
+          <w:color w:val="000000"/>
+          <w:sz w:val="24"/>
+          <w:szCs w:val="24"/>
+        </w:rPr>
+        <w:t xml:space="preserve">onde </w:t>
+      </w:r>
+      <w:r>
+        <w:rPr>
+          <w:rFonts w:ascii="Arial" w:hAnsi="Arial" w:cs="Arial"/>
+          <w:bCs/>
+          <w:color w:val="000000"/>
+          <w:sz w:val="24"/>
+          <w:szCs w:val="24"/>
+        </w:rPr>
+        <w:t>apresenta uma síntese dos riscos de planejamento e de gestão</w:t>
+      </w:r>
+      <w:r>
+        <w:rPr>
+          <w:rFonts w:ascii="Arial" w:hAnsi="Arial" w:cs="Arial"/>
+          <w:bCs/>
+          <w:color w:val="000000"/>
+          <w:sz w:val="24"/>
+          <w:szCs w:val="24"/>
+        </w:rPr>
+        <w:t xml:space="preserve"> </w:t>
+      </w:r>
+      <w:r>
+        <w:rPr>
+          <w:rFonts w:ascii="Arial" w:hAnsi="Arial" w:cs="Arial"/>
+          <w:bCs/>
+          <w:color w:val="000000"/>
+          <w:sz w:val="24"/>
+          <w:szCs w:val="24"/>
+        </w:rPr>
+        <w:t>dos serviços identificados e classificados neste documento.</w:t>
+      </w:r>
+      <w:r>
+        <w:rPr>
+          <w:rFonts w:ascii="Arial" w:hAnsi="Arial" w:cs="Arial"/>
+          <w:bCs/>
+          <w:color w:val="000000"/>
+          <w:sz w:val="24"/>
+          <w:szCs w:val="24"/>
+        </w:rPr>
+        <w:t xml:space="preserve"> </w:t>
+      </w:r>
+    </w:p>
+    <w:p>
+      <w:pPr>
+        <w:shd w:val="clear" w:color="auto" w:fill="FFFFFF"/>
+        <w:spacing w:line="360" w:lineRule="auto"/>
+        <w:jc w:val="both"/>
+        <w:textAlignment w:val="baseline"/>
+        <w:rPr>
+          <w:rFonts w:ascii="Arial" w:hAnsi="Arial" w:cs="Arial"/>
+          <w:bCs/>
+          <w:color w:val="000000"/>
+          <w:sz w:val="24"/>
+          <w:szCs w:val="24"/>
+        </w:rPr>
+      </w:pPr>
+    </w:p>
+    <w:tbl>
+      <w:tblPr>
+        <w:tblStyle w:val="Tabelacomgrade"/>
+        <w:tblW w:w="0" w:type="auto"/>
+        <w:tblLook w:val="04A0" w:firstRow="1" w:lastRow="0" w:firstColumn="1" w:lastColumn="0" w:noHBand="0" w:noVBand="1"/>
+      </w:tblPr>
+      <w:tblGrid>
+        <w:gridCol w:w="2547"/>
+        <w:gridCol w:w="5947"/>
+      </w:tblGrid>
+      <w:tr>
+        <w:tc>
+          <w:tcPr>
+            <w:tcW w:w="2547" w:type="dxa"/>
+          </w:tcPr>
+          <w:p>
+            <w:pPr>
+              <w:spacing w:line="360" w:lineRule="auto"/>
+              <w:jc w:val="both"/>
+              <w:textAlignment w:val="baseline"/>
+              <w:rPr>
+                <w:rFonts w:ascii="Arial" w:hAnsi="Arial" w:cs="Arial"/>
+                <w:bCs/>
+                <w:color w:val="000000"/>
+                <w:sz w:val="24"/>
+                <w:szCs w:val="24"/>
+              </w:rPr>
+            </w:pPr>
+            <w:r>
+              <w:rPr>
+                <w:rFonts w:ascii="Arial" w:hAnsi="Arial" w:cs="Arial"/>
+                <w:bCs/>
+                <w:color w:val="000000"/>
+                <w:sz w:val="24"/>
+                <w:szCs w:val="24"/>
+              </w:rPr>
+              <w:t xml:space="preserve">Risco </w:t>
+            </w:r>
+            <w:r>
+              <w:rPr>
+                <w:rFonts w:ascii="Arial" w:hAnsi="Arial" w:cs="Arial"/>
+                <w:bCs/>
+                <w:color w:val="000000"/>
+                <w:sz w:val="24"/>
+                <w:szCs w:val="24"/>
+              </w:rPr>
+              <w:t>1</w:t>
+            </w:r>
+          </w:p>
+        </w:tc>
+        <w:tc>
+          <w:tcPr>
+            <w:tcW w:w="5947" w:type="dxa"/>
+          </w:tcPr>
+          <w:p>
+            <w:pPr>
+              <w:spacing w:line="360" w:lineRule="auto"/>
+              <w:jc w:val="both"/>
+              <w:textAlignment w:val="baseline"/>
+              <w:rPr>
+                <w:rFonts w:ascii="Arial" w:hAnsi="Arial" w:cs="Arial"/>
+                <w:bCs/>
+                <w:color w:val="000000"/>
+                <w:sz w:val="24"/>
+                <w:szCs w:val="24"/>
+              </w:rPr>
+            </w:pPr>
+            <w:r>
+              <w:rPr>
+                <w:rFonts w:ascii="Arial" w:hAnsi="Arial" w:cs="Arial"/>
+                <w:bCs/>
+                <w:color w:val="000000"/>
+                <w:sz w:val="24"/>
+                <w:szCs w:val="24"/>
+              </w:rPr>
+              <w:t xml:space="preserve">Viabilidade </w:t>
+            </w:r>
+            <w:r>
+              <w:rPr>
+                <w:rFonts w:ascii="Arial" w:hAnsi="Arial" w:cs="Arial"/>
+                <w:bCs/>
+                <w:color w:val="000000"/>
+                <w:sz w:val="24"/>
+                <w:szCs w:val="24"/>
+              </w:rPr>
+              <w:t xml:space="preserve">Técnica e </w:t>
+            </w:r>
+            <w:r>
+              <w:rPr>
+                <w:rFonts w:ascii="Arial" w:hAnsi="Arial" w:cs="Arial"/>
+                <w:bCs/>
+                <w:color w:val="000000"/>
+                <w:sz w:val="24"/>
+                <w:szCs w:val="24"/>
+              </w:rPr>
+              <w:t>Operacional</w:t>
+            </w:r>
+          </w:p>
+        </w:tc>
+      </w:tr>
+      <w:tr>
+        <w:tc>
+          <w:tcPr>
+            <w:tcW w:w="2547" w:type="dxa"/>
+          </w:tcPr>
+          <w:p>
+            <w:pPr>
+              <w:spacing w:line="360" w:lineRule="auto"/>
+              <w:jc w:val="both"/>
+              <w:textAlignment w:val="baseline"/>
+              <w:rPr>
+                <w:rFonts w:ascii="Arial" w:hAnsi="Arial" w:cs="Arial"/>
+                <w:bCs/>
+                <w:color w:val="000000"/>
+                <w:sz w:val="24"/>
+                <w:szCs w:val="24"/>
+              </w:rPr>
+            </w:pPr>
+            <w:r>
+              <w:rPr>
+                <w:rFonts w:ascii="Arial" w:hAnsi="Arial" w:cs="Arial"/>
+                <w:bCs/>
+                <w:color w:val="000000"/>
+                <w:sz w:val="24"/>
+                <w:szCs w:val="24"/>
+              </w:rPr>
+              <w:t>Probabilidade</w:t>
+            </w:r>
+          </w:p>
+        </w:tc>
+        <w:tc>
+          <w:tcPr>
+            <w:tcW w:w="5947" w:type="dxa"/>
+          </w:tcPr>
+          <w:p>
+            <w:pPr>
+              <w:spacing w:line="360" w:lineRule="auto"/>
+              <w:jc w:val="both"/>
+              <w:textAlignment w:val="baseline"/>
+              <w:rPr>
+                <w:rFonts w:ascii="Arial" w:hAnsi="Arial" w:cs="Arial"/>
+                <w:bCs/>
+                <w:color w:val="000000"/>
+                <w:sz w:val="24"/>
+                <w:szCs w:val="24"/>
+              </w:rPr>
+            </w:pPr>
+            <w:r>
+              <w:rPr>
+                <w:rFonts w:ascii="Arial" w:hAnsi="Arial" w:cs="Arial"/>
+                <w:bCs/>
+                <w:color w:val="000000"/>
+                <w:sz w:val="24"/>
+                <w:szCs w:val="24"/>
+              </w:rPr>
+              <w:t>Baixa</w:t>
+            </w:r>
+          </w:p>
+        </w:tc>
+      </w:tr>
+      <w:tr>
+        <w:tc>
+          <w:tcPr>
+            <w:tcW w:w="2547" w:type="dxa"/>
+          </w:tcPr>
+          <w:p>
+            <w:pPr>
+              <w:spacing w:line="360" w:lineRule="auto"/>
+              <w:jc w:val="both"/>
+              <w:textAlignment w:val="baseline"/>
+              <w:rPr>
+                <w:rFonts w:ascii="Arial" w:hAnsi="Arial" w:cs="Arial"/>
+                <w:bCs/>
+                <w:color w:val="000000"/>
+                <w:sz w:val="24"/>
+                <w:szCs w:val="24"/>
+              </w:rPr>
+            </w:pPr>
+            <w:r>
+              <w:rPr>
+                <w:rFonts w:ascii="Arial" w:hAnsi="Arial" w:cs="Arial"/>
+                <w:bCs/>
+                <w:color w:val="000000"/>
+                <w:sz w:val="24"/>
+                <w:szCs w:val="24"/>
+              </w:rPr>
+              <w:t>Impacto</w:t>
+            </w:r>
+          </w:p>
+        </w:tc>
+        <w:tc>
+          <w:tcPr>
+            <w:tcW w:w="5947" w:type="dxa"/>
+          </w:tcPr>
+          <w:p>
+            <w:pPr>
+              <w:spacing w:line="360" w:lineRule="auto"/>
+              <w:jc w:val="both"/>
+              <w:textAlignment w:val="baseline"/>
+              <w:rPr>
+                <w:rFonts w:ascii="Arial" w:hAnsi="Arial" w:cs="Arial"/>
+                <w:bCs/>
+                <w:color w:val="000000"/>
+                <w:sz w:val="24"/>
+                <w:szCs w:val="24"/>
+              </w:rPr>
+            </w:pPr>
+            <w:r>
+              <w:rPr>
+                <w:rFonts w:ascii="Arial" w:hAnsi="Arial" w:cs="Arial"/>
+                <w:bCs/>
+                <w:color w:val="000000"/>
+                <w:sz w:val="24"/>
+                <w:szCs w:val="24"/>
+              </w:rPr>
+              <w:t>Alta</w:t>
+            </w:r>
+          </w:p>
+        </w:tc>
+      </w:tr>
+      <w:tr>
+        <w:tc>
+          <w:tcPr>
+            <w:tcW w:w="2547" w:type="dxa"/>
+          </w:tcPr>
+          <w:p>
+            <w:pPr>
+              <w:spacing w:line="360" w:lineRule="auto"/>
+              <w:jc w:val="both"/>
+              <w:textAlignment w:val="baseline"/>
+              <w:rPr>
+                <w:rFonts w:ascii="Arial" w:hAnsi="Arial" w:cs="Arial"/>
+                <w:bCs/>
+                <w:color w:val="000000"/>
+                <w:sz w:val="24"/>
+                <w:szCs w:val="24"/>
+              </w:rPr>
+            </w:pPr>
+            <w:r>
+              <w:rPr>
+                <w:rFonts w:ascii="Arial" w:hAnsi="Arial" w:cs="Arial"/>
+                <w:bCs/>
+                <w:color w:val="000000"/>
+                <w:sz w:val="24"/>
+                <w:szCs w:val="24"/>
+              </w:rPr>
+              <w:t>Dano</w:t>
+            </w:r>
+          </w:p>
+        </w:tc>
+        <w:tc>
+          <w:tcPr>
+            <w:tcW w:w="5947" w:type="dxa"/>
+          </w:tcPr>
+          <w:p>
+            <w:pPr>
+              <w:spacing w:line="360" w:lineRule="auto"/>
+              <w:jc w:val="both"/>
+              <w:textAlignment w:val="baseline"/>
+              <w:rPr>
+                <w:rFonts w:ascii="Arial" w:hAnsi="Arial" w:cs="Arial"/>
+                <w:bCs/>
+                <w:color w:val="000000"/>
+                <w:sz w:val="24"/>
+                <w:szCs w:val="24"/>
+              </w:rPr>
+            </w:pPr>
+            <w:r>
+              <w:rPr>
+                <w:rFonts w:ascii="Arial" w:hAnsi="Arial" w:cs="Arial"/>
+                <w:bCs/>
+                <w:color w:val="000000"/>
+                <w:sz w:val="24"/>
+                <w:szCs w:val="24"/>
+              </w:rPr>
+              <w:t>Prejuízo financeiro e Risco à qualidade do serviço</w:t>
+            </w:r>
+          </w:p>
+        </w:tc>
+      </w:tr>
+      <w:tr>
+        <w:tc>
+          <w:tcPr>
+            <w:tcW w:w="2547" w:type="dxa"/>
+          </w:tcPr>
+          <w:p>
+            <w:pPr>
+              <w:spacing w:line="360" w:lineRule="auto"/>
+              <w:jc w:val="both"/>
+              <w:textAlignment w:val="baseline"/>
+              <w:rPr>
+                <w:rFonts w:ascii="Arial" w:hAnsi="Arial" w:cs="Arial"/>
+                <w:bCs/>
+                <w:color w:val="000000"/>
+                <w:sz w:val="24"/>
+                <w:szCs w:val="24"/>
+              </w:rPr>
+            </w:pPr>
+            <w:r>
+              <w:rPr>
+                <w:rFonts w:ascii="Arial" w:hAnsi="Arial" w:cs="Arial"/>
+                <w:bCs/>
+                <w:color w:val="000000"/>
+                <w:sz w:val="24"/>
+                <w:szCs w:val="24"/>
+              </w:rPr>
+              <w:t>Ação Preventiva</w:t>
+            </w:r>
+          </w:p>
+        </w:tc>
+        <w:tc>
+          <w:tcPr>
+            <w:tcW w:w="5947" w:type="dxa"/>
+          </w:tcPr>
+          <w:p>
+            <w:pPr>
+              <w:spacing w:line="360" w:lineRule="auto"/>
+              <w:jc w:val="both"/>
+              <w:textAlignment w:val="baseline"/>
+              <w:rPr>
+                <w:rFonts w:ascii="Arial" w:hAnsi="Arial" w:cs="Arial"/>
+                <w:bCs/>
+                <w:color w:val="000000"/>
+                <w:sz w:val="24"/>
+                <w:szCs w:val="24"/>
+              </w:rPr>
+            </w:pPr>
+            <w:r>
+              <w:rPr>
+                <w:rFonts w:ascii="Arial" w:hAnsi="Arial" w:cs="Arial"/>
+                <w:bCs/>
+                <w:color w:val="000000"/>
+                <w:sz w:val="24"/>
+                <w:szCs w:val="24"/>
+              </w:rPr>
+              <w:t>Exigência de atestado e qualificação técnica</w:t>
+            </w:r>
+          </w:p>
+        </w:tc>
+      </w:tr>
+      <w:tr>
+        <w:tc>
+          <w:tcPr>
+            <w:tcW w:w="2547" w:type="dxa"/>
+          </w:tcPr>
+          <w:p>
+            <w:pPr>
+              <w:spacing w:line="360" w:lineRule="auto"/>
+              <w:jc w:val="both"/>
+              <w:textAlignment w:val="baseline"/>
+              <w:rPr>
+                <w:rFonts w:ascii="Arial" w:hAnsi="Arial" w:cs="Arial"/>
+                <w:bCs/>
+                <w:color w:val="000000"/>
+                <w:sz w:val="24"/>
+                <w:szCs w:val="24"/>
+              </w:rPr>
+            </w:pPr>
+            <w:r>
+              <w:rPr>
+                <w:rFonts w:ascii="Arial" w:hAnsi="Arial" w:cs="Arial"/>
+                <w:bCs/>
+                <w:color w:val="000000"/>
+                <w:sz w:val="24"/>
+                <w:szCs w:val="24"/>
+              </w:rPr>
+              <w:t>Ação de Contingência</w:t>
+            </w:r>
+          </w:p>
+        </w:tc>
+        <w:tc>
+          <w:tcPr>
+            <w:tcW w:w="5947" w:type="dxa"/>
+          </w:tcPr>
+          <w:p>
+            <w:pPr>
+              <w:spacing w:line="360" w:lineRule="auto"/>
+              <w:jc w:val="both"/>
+              <w:textAlignment w:val="baseline"/>
+              <w:rPr>
+                <w:rFonts w:ascii="Arial" w:hAnsi="Arial" w:cs="Arial"/>
+                <w:bCs/>
+                <w:color w:val="000000"/>
+                <w:sz w:val="24"/>
+                <w:szCs w:val="24"/>
+              </w:rPr>
+            </w:pPr>
+            <w:r>
+              <w:rPr>
+                <w:rFonts w:ascii="Arial" w:hAnsi="Arial" w:cs="Arial"/>
+                <w:bCs/>
+                <w:color w:val="000000"/>
+                <w:sz w:val="24"/>
+                <w:szCs w:val="24"/>
+              </w:rPr>
+              <w:t>Refazer serviços de baixa qualidade e aplicação de sanções.</w:t>
+            </w:r>
+          </w:p>
+        </w:tc>
+      </w:tr>
+    </w:tbl>
+    <w:p>
+      <w:pPr>
+        <w:rPr>
+          <w:rFonts w:ascii="Arial" w:hAnsi="Arial" w:cs="Arial"/>
+          <w:b/>
+          <w:sz w:val="24"/>
+          <w:szCs w:val="24"/>
+        </w:rPr>
+      </w:pPr>
+    </w:p>
+    <w:tbl>
+      <w:tblPr>
+        <w:tblStyle w:val="Tabelacomgrade"/>
+        <w:tblW w:w="0" w:type="auto"/>
+        <w:tblLook w:val="04A0" w:firstRow="1" w:lastRow="0" w:firstColumn="1" w:lastColumn="0" w:noHBand="0" w:noVBand="1"/>
+      </w:tblPr>
+      <w:tblGrid>
+        <w:gridCol w:w="2547"/>
+        <w:gridCol w:w="5947"/>
+      </w:tblGrid>
+      <w:tr>
+        <w:tc>
+          <w:tcPr>
+            <w:tcW w:w="2547" w:type="dxa"/>
+          </w:tcPr>
+          <w:p>
+            <w:pPr>
+              <w:spacing w:line="360" w:lineRule="auto"/>
+              <w:jc w:val="both"/>
+              <w:textAlignment w:val="baseline"/>
+              <w:rPr>
+                <w:rFonts w:ascii="Arial" w:hAnsi="Arial" w:cs="Arial"/>
+                <w:bCs/>
+                <w:color w:val="000000"/>
+                <w:sz w:val="24"/>
+                <w:szCs w:val="24"/>
+              </w:rPr>
+            </w:pPr>
+            <w:r>
+              <w:rPr>
+                <w:rFonts w:ascii="Arial" w:hAnsi="Arial" w:cs="Arial"/>
+                <w:bCs/>
+                <w:color w:val="000000"/>
+                <w:sz w:val="24"/>
+                <w:szCs w:val="24"/>
+              </w:rPr>
+              <w:t xml:space="preserve">Risco </w:t>
+            </w:r>
+            <w:r>
+              <w:rPr>
+                <w:rFonts w:ascii="Arial" w:hAnsi="Arial" w:cs="Arial"/>
+                <w:bCs/>
+                <w:color w:val="000000"/>
+                <w:sz w:val="24"/>
+                <w:szCs w:val="24"/>
+              </w:rPr>
+              <w:t>2</w:t>
+            </w:r>
+          </w:p>
+        </w:tc>
+        <w:tc>
+          <w:tcPr>
+            <w:tcW w:w="5947" w:type="dxa"/>
+          </w:tcPr>
+          <w:p>
+            <w:pPr>
+              <w:spacing w:line="360" w:lineRule="auto"/>
+              <w:jc w:val="both"/>
+              <w:textAlignment w:val="baseline"/>
+              <w:rPr>
+                <w:rFonts w:ascii="Arial" w:hAnsi="Arial" w:cs="Arial"/>
+                <w:bCs/>
+                <w:color w:val="000000"/>
+                <w:sz w:val="24"/>
+                <w:szCs w:val="24"/>
+              </w:rPr>
+            </w:pPr>
+            <w:r>
+              <w:rPr>
+                <w:rFonts w:ascii="Arial" w:hAnsi="Arial" w:cs="Arial"/>
+                <w:bCs/>
+                <w:color w:val="000000"/>
+                <w:sz w:val="24"/>
+                <w:szCs w:val="24"/>
+              </w:rPr>
+              <w:t>Viabilidade Orçamentária</w:t>
+            </w:r>
+          </w:p>
+        </w:tc>
+      </w:tr>
+      <w:tr>
+        <w:tc>
+          <w:tcPr>
+            <w:tcW w:w="2547" w:type="dxa"/>
+          </w:tcPr>
+          <w:p>
+            <w:pPr>
+              <w:spacing w:line="360" w:lineRule="auto"/>
+              <w:jc w:val="both"/>
+              <w:textAlignment w:val="baseline"/>
+              <w:rPr>
+                <w:rFonts w:ascii="Arial" w:hAnsi="Arial" w:cs="Arial"/>
+                <w:bCs/>
+                <w:color w:val="000000"/>
+                <w:sz w:val="24"/>
+                <w:szCs w:val="24"/>
+              </w:rPr>
+            </w:pPr>
+            <w:r>
+              <w:rPr>
+                <w:rFonts w:ascii="Arial" w:hAnsi="Arial" w:cs="Arial"/>
+                <w:bCs/>
+                <w:color w:val="000000"/>
+                <w:sz w:val="24"/>
+                <w:szCs w:val="24"/>
+              </w:rPr>
+              <w:t>Probabilidade</w:t>
+            </w:r>
+          </w:p>
+        </w:tc>
+        <w:tc>
+          <w:tcPr>
+            <w:tcW w:w="5947" w:type="dxa"/>
+          </w:tcPr>
+          <w:p>
+            <w:pPr>
+              <w:spacing w:line="360" w:lineRule="auto"/>
+              <w:jc w:val="both"/>
+              <w:textAlignment w:val="baseline"/>
+              <w:rPr>
+                <w:rFonts w:ascii="Arial" w:hAnsi="Arial" w:cs="Arial"/>
+                <w:bCs/>
+                <w:color w:val="000000"/>
+                <w:sz w:val="24"/>
+                <w:szCs w:val="24"/>
+              </w:rPr>
+            </w:pPr>
+            <w:r>
+              <w:rPr>
+                <w:rFonts w:ascii="Arial" w:hAnsi="Arial" w:cs="Arial"/>
+                <w:bCs/>
+                <w:color w:val="000000"/>
+                <w:sz w:val="24"/>
+                <w:szCs w:val="24"/>
+              </w:rPr>
+              <w:t>Baixa</w:t>
+            </w:r>
+          </w:p>
+        </w:tc>
+      </w:tr>
+      <w:tr>
+        <w:tc>
+          <w:tcPr>
+            <w:tcW w:w="2547" w:type="dxa"/>
+          </w:tcPr>
+          <w:p>
+            <w:pPr>
+              <w:spacing w:line="360" w:lineRule="auto"/>
+              <w:jc w:val="both"/>
+              <w:textAlignment w:val="baseline"/>
+              <w:rPr>
+                <w:rFonts w:ascii="Arial" w:hAnsi="Arial" w:cs="Arial"/>
+                <w:bCs/>
+                <w:color w:val="000000"/>
+                <w:sz w:val="24"/>
+                <w:szCs w:val="24"/>
+              </w:rPr>
+            </w:pPr>
+            <w:r>
+              <w:rPr>
+                <w:rFonts w:ascii="Arial" w:hAnsi="Arial" w:cs="Arial"/>
+                <w:bCs/>
+                <w:color w:val="000000"/>
+                <w:sz w:val="24"/>
+                <w:szCs w:val="24"/>
+              </w:rPr>
+              <w:t>Impacto</w:t>
+            </w:r>
+          </w:p>
+        </w:tc>
+        <w:tc>
+          <w:tcPr>
+            <w:tcW w:w="5947" w:type="dxa"/>
+          </w:tcPr>
+          <w:p>
+            <w:pPr>
+              <w:spacing w:line="360" w:lineRule="auto"/>
+              <w:jc w:val="both"/>
+              <w:textAlignment w:val="baseline"/>
+              <w:rPr>
+                <w:rFonts w:ascii="Arial" w:hAnsi="Arial" w:cs="Arial"/>
+                <w:bCs/>
+                <w:color w:val="000000"/>
+                <w:sz w:val="24"/>
+                <w:szCs w:val="24"/>
+              </w:rPr>
+            </w:pPr>
+            <w:r>
+              <w:rPr>
+                <w:rFonts w:ascii="Arial" w:hAnsi="Arial" w:cs="Arial"/>
+                <w:bCs/>
+                <w:color w:val="000000"/>
+                <w:sz w:val="24"/>
+                <w:szCs w:val="24"/>
+              </w:rPr>
+              <w:t>Alto</w:t>
+            </w:r>
+          </w:p>
+        </w:tc>
+      </w:tr>
+      <w:tr>
+        <w:tc>
+          <w:tcPr>
+            <w:tcW w:w="2547" w:type="dxa"/>
+          </w:tcPr>
+          <w:p>
+            <w:pPr>
+              <w:spacing w:line="360" w:lineRule="auto"/>
+              <w:jc w:val="both"/>
+              <w:textAlignment w:val="baseline"/>
+              <w:rPr>
+                <w:rFonts w:ascii="Arial" w:hAnsi="Arial" w:cs="Arial"/>
+                <w:bCs/>
+                <w:color w:val="000000"/>
+                <w:sz w:val="24"/>
+                <w:szCs w:val="24"/>
+              </w:rPr>
+            </w:pPr>
+            <w:r>
+              <w:rPr>
+                <w:rFonts w:ascii="Arial" w:hAnsi="Arial" w:cs="Arial"/>
+                <w:bCs/>
+                <w:color w:val="000000"/>
+                <w:sz w:val="24"/>
+                <w:szCs w:val="24"/>
+              </w:rPr>
+              <w:t>Dano</w:t>
+            </w:r>
+          </w:p>
+        </w:tc>
+        <w:tc>
+          <w:tcPr>
+            <w:tcW w:w="5947" w:type="dxa"/>
+          </w:tcPr>
+          <w:p>
+            <w:pPr>
+              <w:tabs>
+                <w:tab w:val="left" w:pos="34"/>
+              </w:tabs>
+              <w:spacing w:line="360" w:lineRule="auto"/>
+              <w:jc w:val="both"/>
+              <w:textAlignment w:val="baseline"/>
+              <w:rPr>
+                <w:rFonts w:ascii="Arial" w:hAnsi="Arial" w:cs="Arial"/>
+                <w:bCs/>
+                <w:color w:val="000000"/>
+                <w:sz w:val="24"/>
+                <w:szCs w:val="24"/>
+              </w:rPr>
+            </w:pPr>
+            <w:r>
+              <w:rPr>
+                <w:rFonts w:ascii="Arial" w:hAnsi="Arial" w:cs="Arial"/>
+                <w:bCs/>
+                <w:color w:val="000000"/>
+                <w:sz w:val="24"/>
+                <w:szCs w:val="24"/>
+              </w:rPr>
+              <w:tab/>
+              <w:t>Disputa de Preço</w:t>
+            </w:r>
+          </w:p>
+        </w:tc>
+      </w:tr>
+      <w:tr>
+        <w:tc>
+          <w:tcPr>
+            <w:tcW w:w="2547" w:type="dxa"/>
+          </w:tcPr>
+          <w:p>
+            <w:pPr>
+              <w:spacing w:line="360" w:lineRule="auto"/>
+              <w:jc w:val="both"/>
+              <w:textAlignment w:val="baseline"/>
+              <w:rPr>
+                <w:rFonts w:ascii="Arial" w:hAnsi="Arial" w:cs="Arial"/>
+                <w:bCs/>
+                <w:color w:val="000000"/>
+                <w:sz w:val="24"/>
+                <w:szCs w:val="24"/>
+              </w:rPr>
+            </w:pPr>
+            <w:r>
+              <w:rPr>
+                <w:rFonts w:ascii="Arial" w:hAnsi="Arial" w:cs="Arial"/>
+                <w:bCs/>
+                <w:color w:val="000000"/>
+                <w:sz w:val="24"/>
+                <w:szCs w:val="24"/>
+              </w:rPr>
+              <w:t>Ação Preventiva</w:t>
+            </w:r>
+          </w:p>
+        </w:tc>
+        <w:tc>
+          <w:tcPr>
+            <w:tcW w:w="5947" w:type="dxa"/>
+          </w:tcPr>
+          <w:p>
+            <w:pPr>
+              <w:spacing w:line="360" w:lineRule="auto"/>
+              <w:jc w:val="both"/>
+              <w:textAlignment w:val="baseline"/>
+              <w:rPr>
+                <w:rFonts w:ascii="Arial" w:hAnsi="Arial" w:cs="Arial"/>
+                <w:bCs/>
+                <w:color w:val="000000"/>
+                <w:sz w:val="24"/>
+                <w:szCs w:val="24"/>
+              </w:rPr>
+            </w:pPr>
+            <w:r>
+              <w:rPr>
+                <w:rFonts w:ascii="Arial" w:hAnsi="Arial" w:cs="Arial"/>
+                <w:bCs/>
+                <w:color w:val="000000"/>
+                <w:sz w:val="24"/>
+                <w:szCs w:val="24"/>
+              </w:rPr>
+              <w:t>Realizar pesquisa de Preço atual através de tabelas Oficiais.</w:t>
+            </w:r>
+          </w:p>
+        </w:tc>
+      </w:tr>
+      <w:tr>
+        <w:tc>
+          <w:tcPr>
+            <w:tcW w:w="2547" w:type="dxa"/>
+          </w:tcPr>
+          <w:p>
+            <w:pPr>
+              <w:spacing w:line="360" w:lineRule="auto"/>
+              <w:jc w:val="both"/>
+              <w:textAlignment w:val="baseline"/>
+              <w:rPr>
+                <w:rFonts w:ascii="Arial" w:hAnsi="Arial" w:cs="Arial"/>
+                <w:bCs/>
+                <w:color w:val="000000"/>
+                <w:sz w:val="24"/>
+                <w:szCs w:val="24"/>
+              </w:rPr>
+            </w:pPr>
+            <w:r>
+              <w:rPr>
+                <w:rFonts w:ascii="Arial" w:hAnsi="Arial" w:cs="Arial"/>
+                <w:bCs/>
+                <w:color w:val="000000"/>
+                <w:sz w:val="24"/>
+                <w:szCs w:val="24"/>
+              </w:rPr>
+              <w:t>Ação de Contingência</w:t>
+            </w:r>
+          </w:p>
+        </w:tc>
+        <w:tc>
+          <w:tcPr>
+            <w:tcW w:w="5947" w:type="dxa"/>
+          </w:tcPr>
+          <w:p>
+            <w:pPr>
+              <w:spacing w:line="360" w:lineRule="auto"/>
+              <w:jc w:val="both"/>
+              <w:textAlignment w:val="baseline"/>
+              <w:rPr>
+                <w:rFonts w:ascii="Arial" w:hAnsi="Arial" w:cs="Arial"/>
+                <w:bCs/>
+                <w:color w:val="000000"/>
+                <w:sz w:val="24"/>
+                <w:szCs w:val="24"/>
+              </w:rPr>
+            </w:pPr>
+            <w:r>
+              <w:rPr>
+                <w:rFonts w:ascii="Arial" w:hAnsi="Arial" w:cs="Arial"/>
+                <w:bCs/>
+                <w:color w:val="000000"/>
+                <w:sz w:val="24"/>
+                <w:szCs w:val="24"/>
+              </w:rPr>
+              <w:t>Apuração de eventuais equívocos no orçamento.</w:t>
+            </w:r>
+          </w:p>
+        </w:tc>
+      </w:tr>
+    </w:tbl>
+    <w:p>
+      <w:pPr>
+        <w:tabs>
+          <w:tab w:val="left" w:pos="345"/>
+        </w:tabs>
+        <w:rPr>
+          <w:rFonts w:ascii="Arial" w:hAnsi="Arial" w:cs="Arial"/>
+          <w:b/>
+          <w:sz w:val="24"/>
+          <w:szCs w:val="24"/>
+        </w:rPr>
+      </w:pPr>
+      <w:r>
+        <w:rPr>
+          <w:rFonts w:ascii="Arial" w:hAnsi="Arial" w:cs="Arial"/>
+          <w:b/>
+          <w:sz w:val="24"/>
+          <w:szCs w:val="24"/>
+        </w:rPr>
+        <w:tab/>
+      </w:r>
+    </w:p>
+    <w:p>
+      <w:pPr>
+        <w:rPr>
+          <w:rFonts w:ascii="Arial" w:hAnsi="Arial" w:cs="Arial"/>
+          <w:color w:val="FF0000"/>
+          <w:sz w:val="24"/>
+          <w:szCs w:val="24"/>
+        </w:rPr>
+      </w:pPr>
+      <w:bookmarkStart w:id="0" w:name="_GoBack"/>
+      <w:r>
+        <w:rPr>
+          <w:rFonts w:ascii="Arial" w:hAnsi="Arial" w:cs="Arial"/>
+          <w:color w:val="FF0000"/>
+          <w:sz w:val="24"/>
+          <w:szCs w:val="24"/>
+        </w:rPr>
+        <w:t>{{etp_date}}</w:t>
+      </w:r>
+      <w:r>
+        <w:rPr>
+          <w:rFonts w:ascii="Arial" w:hAnsi="Arial" w:cs="Arial"/>
+          <w:color w:val="FF0000"/>
+          <w:sz w:val="24"/>
+          <w:szCs w:val="24"/>
+        </w:rPr>
+        <w:t/>
+      </w:r>
+      <w:r>
+        <w:rPr>
+          <w:rFonts w:ascii="Arial" w:hAnsi="Arial" w:cs="Arial"/>
+          <w:color w:val="FF0000"/>
+          <w:sz w:val="24"/>
+          <w:szCs w:val="24"/>
+        </w:rPr>
+        <w:t xml:space="preserve"/>
+      </w:r>
+      <w:r>
+        <w:rPr>
+          <w:rFonts w:ascii="Arial" w:hAnsi="Arial" w:cs="Arial"/>
+          <w:color w:val="FF0000"/>
+          <w:sz w:val="24"/>
+          <w:szCs w:val="24"/>
+        </w:rPr>
+        <w:t/>
+      </w:r>
+      <w:r>
+        <w:rPr>
+          <w:rFonts w:ascii="Arial" w:hAnsi="Arial" w:cs="Arial"/>
+          <w:color w:val="FF0000"/>
+          <w:sz w:val="24"/>
+          <w:szCs w:val="24"/>
+        </w:rPr>
+        <w:t xml:space="preserve"/>
+      </w:r>
+      <w:r>
+        <w:rPr>
+          <w:rFonts w:ascii="Arial" w:hAnsi="Arial" w:cs="Arial"/>
+          <w:color w:val="FF0000"/>
+          <w:sz w:val="24"/>
+          <w:szCs w:val="24"/>
+        </w:rPr>
+        <w:t/>
+      </w:r>
+    </w:p>
+    <w:bookmarkEnd w:id="0"/>
+    <w:p>
+      <w:pPr>
+        <w:jc w:val="center"/>
+        <w:rPr>
+          <w:rFonts w:ascii="Arial" w:hAnsi="Arial" w:cs="Arial"/>
+          <w:b/>
+          <w:sz w:val="24"/>
+          <w:szCs w:val="24"/>
+        </w:rPr>
+      </w:pPr>
+    </w:p>
+    <w:p>
+      <w:pPr>
+        <w:rPr>
+          <w:rFonts w:ascii="Arial" w:hAnsi="Arial" w:cs="Arial"/>
+          <w:b/>
+          <w:sz w:val="24"/>
+          <w:szCs w:val="24"/>
+        </w:rPr>
+      </w:pPr>
+    </w:p>
+    <w:p>
+      <w:pPr>
+        <w:jc w:val="center"/>
+        <w:rPr>
+          <w:rFonts w:ascii="Arial" w:hAnsi="Arial" w:cs="Arial"/>
+          <w:b/>
+          <w:sz w:val="24"/>
+          <w:szCs w:val="24"/>
+        </w:rPr>
+      </w:pPr>
+    </w:p>
+    <w:p>
+      <w:pPr>
+        <w:spacing w:line="360" w:lineRule="auto"/>
+        <w:jc w:val="center"/>
+        <w:rPr>
+          <w:rFonts w:ascii="Arial" w:hAnsi="Arial" w:cs="Arial"/>
+          <w:sz w:val="24"/>
+          <w:szCs w:val="24"/>
+        </w:rPr>
+      </w:pPr>
+      <w:proofErr w:type="gramStart"/>
+      <w:r>
+        <w:rPr>
+          <w:rFonts w:ascii="Arial" w:hAnsi="Arial" w:cs="Arial"/>
+          <w:sz w:val="24"/>
+          <w:szCs w:val="24"/>
+        </w:rPr>
+        <w:t xml:space="preserve">Eng. Jussara </w:t>
+      </w:r>
+      <w:proofErr w:type="spellStart"/>
+      <w:r>
+        <w:rPr>
+          <w:rFonts w:ascii="Arial" w:hAnsi="Arial" w:cs="Arial"/>
+          <w:sz w:val="24"/>
+          <w:szCs w:val="24"/>
+        </w:rPr>
+        <w:t>Inocencio</w:t>
+      </w:r>
+      <w:proofErr w:type="spellEnd"/>
+      <w:proofErr w:type="gramEnd"/>
+      <w:r>
+        <w:rPr>
+          <w:rFonts w:ascii="Arial" w:hAnsi="Arial" w:cs="Arial"/>
+          <w:sz w:val="24"/>
+          <w:szCs w:val="24"/>
+        </w:rPr>
+        <w:t xml:space="preserve"> dos Santos</w:t>
+      </w:r>
+    </w:p>
+    <w:p>
+      <w:pPr>
+        <w:spacing w:line="360" w:lineRule="auto"/>
+        <w:jc w:val="center"/>
+        <w:rPr>
+          <w:rFonts w:ascii="Arial" w:hAnsi="Arial" w:cs="Arial"/>
+          <w:sz w:val="24"/>
+          <w:szCs w:val="24"/>
+        </w:rPr>
+      </w:pPr>
+      <w:r>
+        <w:rPr>
+          <w:rFonts w:ascii="Arial" w:hAnsi="Arial" w:cs="Arial"/>
+          <w:sz w:val="24"/>
+          <w:szCs w:val="24"/>
+        </w:rPr>
+        <w:t>Chefe de Projetos e Orçamento</w:t>
       </w:r>
     </w:p>
     <w:sectPr>
@@ -419,7 +3915,7 @@
                                   </pic:cNvPicPr>
                                 </pic:nvPicPr>
                                 <pic:blipFill>
-                                  <a:blip r:embed="rId2">
+                                  <a:blip r:embed="rId1">
                                     <a:extLst>
                                       <a:ext uri="{28A0092B-C50C-407E-A947-70E740481C1C}">
                                         <a14:useLocalDpi xmlns:a14="http://schemas.microsoft.com/office/drawing/2010/main" val="0"/>
@@ -534,12 +4030,16 @@
       <w:jc w:val="center"/>
     </w:pPr>
     <w:r>
-      <w:rPr>
-        <w:rFonts w:ascii="Arial" w:hAnsi="Arial" w:cs="Arial"/>
-        <w:sz w:val="24"/>
-        <w:szCs w:val="24"/>
-      </w:rPr>
-      <w:t>{{etp_header_title}}</w:t>
+      <w:t xml:space="preserve">ETP </w:t>
+    </w:r>
+    <w:r>
+      <w:t>–</w:t>
+    </w:r>
+    <w:r>
+      <w:t xml:space="preserve"> </w:t>
+    </w:r>
+    <w:r>
+      <w:t>CENTRO DE GERENCIAMENTO E BENEFICIAMENTO DE RESÍDUOS</w:t>
     </w:r>
   </w:p>
 </w:hdr>

</xml_diff>